<commit_message>
feat: opd TZ edited and done
</commit_message>
<xml_diff>
--- a/Основы профессиональной деятельности/ТЗ 2 сем.docx
+++ b/Основы профессиональной деятельности/ТЗ 2 сем.docx
@@ -1,11 +1,12 @@
 
 <file path=word/document.xml><?xml version="1.0" encoding="utf-8"?>
-<w:document xmlns:wpc="http://schemas.microsoft.com/office/word/2010/wordprocessingCanvas" xmlns:cx="http://schemas.microsoft.com/office/drawing/2014/chartex" xmlns:cx1="http://schemas.microsoft.com/office/drawing/2015/9/8/chartex" xmlns:cx2="http://schemas.microsoft.com/office/drawing/2015/10/21/chartex" xmlns:cx3="http://schemas.microsoft.com/office/drawing/2016/5/9/chartex" xmlns:cx4="http://schemas.microsoft.com/office/drawing/2016/5/10/chartex" xmlns:cx5="http://schemas.microsoft.com/office/drawing/2016/5/11/chartex" xmlns:cx6="http://schemas.microsoft.com/office/drawing/2016/5/12/chartex" xmlns:cx7="http://schemas.microsoft.com/office/drawing/2016/5/13/chartex" xmlns:cx8="http://schemas.microsoft.com/office/drawing/2016/5/14/chartex" xmlns:mc="http://schemas.openxmlformats.org/markup-compatibility/2006" xmlns:aink="http://schemas.microsoft.com/office/drawing/2016/ink" xmlns:am3d="http://schemas.microsoft.com/office/drawing/2017/model3d" xmlns:o="urn:schemas-microsoft-com:office:office" xmlns:r="http://schemas.openxmlformats.org/officeDocument/2006/relationships" xmlns:m="http://schemas.openxmlformats.org/officeDocument/2006/math" xmlns:v="urn:schemas-microsoft-com:vml" xmlns:wp14="http://schemas.microsoft.com/office/word/2010/wordprocessingDrawing" xmlns:wp="http://schemas.openxmlformats.org/drawingml/2006/wordprocessingDrawing" xmlns:w10="urn:schemas-microsoft-com:office:word" xmlns:w="http://schemas.openxmlformats.org/wordprocessingml/2006/main" xmlns:w14="http://schemas.microsoft.com/office/word/2010/wordml" xmlns:w15="http://schemas.microsoft.com/office/word/2012/wordml" xmlns:w16cex="http://schemas.microsoft.com/office/word/2018/wordml/cex" xmlns:w16cid="http://schemas.microsoft.com/office/word/2016/wordml/cid" xmlns:w16="http://schemas.microsoft.com/office/word/2018/wordml" xmlns:w16sdtdh="http://schemas.microsoft.com/office/word/2020/wordml/sdtdatahash" xmlns:w16se="http://schemas.microsoft.com/office/word/2015/wordml/symex" xmlns:wpg="http://schemas.microsoft.com/office/word/2010/wordprocessingGroup" xmlns:wpi="http://schemas.microsoft.com/office/word/2010/wordprocessingInk" xmlns:wne="http://schemas.microsoft.com/office/word/2006/wordml" xmlns:wps="http://schemas.microsoft.com/office/word/2010/wordprocessingShape" mc:Ignorable="w14 w15 w16se w16cid w16 w16cex w16sdtdh wp14">
+<w:document xmlns:wpc="http://schemas.microsoft.com/office/word/2010/wordprocessingCanvas" xmlns:cx="http://schemas.microsoft.com/office/drawing/2014/chartex" xmlns:cx1="http://schemas.microsoft.com/office/drawing/2015/9/8/chartex" xmlns:cx2="http://schemas.microsoft.com/office/drawing/2015/10/21/chartex" xmlns:cx3="http://schemas.microsoft.com/office/drawing/2016/5/9/chartex" xmlns:cx4="http://schemas.microsoft.com/office/drawing/2016/5/10/chartex" xmlns:cx5="http://schemas.microsoft.com/office/drawing/2016/5/11/chartex" xmlns:cx6="http://schemas.microsoft.com/office/drawing/2016/5/12/chartex" xmlns:cx7="http://schemas.microsoft.com/office/drawing/2016/5/13/chartex" xmlns:cx8="http://schemas.microsoft.com/office/drawing/2016/5/14/chartex" xmlns:mc="http://schemas.openxmlformats.org/markup-compatibility/2006" xmlns:aink="http://schemas.microsoft.com/office/drawing/2016/ink" xmlns:am3d="http://schemas.microsoft.com/office/drawing/2017/model3d" xmlns:o="urn:schemas-microsoft-com:office:office" xmlns:oel="http://schemas.microsoft.com/office/2019/extlst" xmlns:r="http://schemas.openxmlformats.org/officeDocument/2006/relationships" xmlns:m="http://schemas.openxmlformats.org/officeDocument/2006/math" xmlns:v="urn:schemas-microsoft-com:vml" xmlns:wp14="http://schemas.microsoft.com/office/word/2010/wordprocessingDrawing" xmlns:wp="http://schemas.openxmlformats.org/drawingml/2006/wordprocessingDrawing" xmlns:w10="urn:schemas-microsoft-com:office:word" xmlns:w="http://schemas.openxmlformats.org/wordprocessingml/2006/main" xmlns:w14="http://schemas.microsoft.com/office/word/2010/wordml" xmlns:w15="http://schemas.microsoft.com/office/word/2012/wordml" xmlns:w16cex="http://schemas.microsoft.com/office/word/2018/wordml/cex" xmlns:w16cid="http://schemas.microsoft.com/office/word/2016/wordml/cid" xmlns:w16="http://schemas.microsoft.com/office/word/2018/wordml" xmlns:w16sdtdh="http://schemas.microsoft.com/office/word/2020/wordml/sdtdatahash" xmlns:w16se="http://schemas.microsoft.com/office/word/2015/wordml/symex" xmlns:wpg="http://schemas.microsoft.com/office/word/2010/wordprocessingGroup" xmlns:wpi="http://schemas.microsoft.com/office/word/2010/wordprocessingInk" xmlns:wne="http://schemas.microsoft.com/office/word/2006/wordml" xmlns:wps="http://schemas.microsoft.com/office/word/2010/wordprocessingShape" mc:Ignorable="w14 w15 w16se w16cid w16 w16cex w16sdtdh wp14">
   <w:body>
     <w:p>
       <w:pPr>
-        <w:spacing w:after="0" w:line="324" w:lineRule="auto"/>
+        <w:spacing w:after="0" w:line="312" w:lineRule="auto"/>
         <w:ind w:left="0" w:right="0" w:firstLine="0"/>
+        <w:contextualSpacing/>
         <w:jc w:val="center"/>
         <w:rPr>
           <w:sz w:val="28"/>
@@ -38,8 +39,9 @@
     </w:p>
     <w:p>
       <w:pPr>
-        <w:spacing w:after="0" w:line="324" w:lineRule="auto"/>
+        <w:spacing w:after="0" w:line="312" w:lineRule="auto"/>
         <w:ind w:left="0" w:right="0" w:firstLine="0"/>
+        <w:contextualSpacing/>
         <w:jc w:val="center"/>
         <w:rPr>
           <w:sz w:val="28"/>
@@ -56,8 +58,9 @@
     </w:p>
     <w:p>
       <w:pPr>
-        <w:spacing w:after="0" w:line="324" w:lineRule="auto"/>
+        <w:spacing w:after="0" w:line="312" w:lineRule="auto"/>
         <w:ind w:left="0" w:right="0" w:firstLine="0"/>
+        <w:contextualSpacing/>
         <w:jc w:val="center"/>
         <w:rPr>
           <w:sz w:val="28"/>
@@ -74,8 +77,9 @@
     </w:p>
     <w:p>
       <w:pPr>
-        <w:spacing w:after="0" w:line="324" w:lineRule="auto"/>
+        <w:spacing w:after="0" w:line="312" w:lineRule="auto"/>
         <w:ind w:left="0" w:right="0" w:firstLine="0"/>
+        <w:contextualSpacing/>
         <w:jc w:val="center"/>
         <w:rPr>
           <w:sz w:val="28"/>
@@ -92,8 +96,9 @@
     </w:p>
     <w:p>
       <w:pPr>
-        <w:spacing w:after="0" w:line="324" w:lineRule="auto"/>
+        <w:spacing w:after="0" w:line="312" w:lineRule="auto"/>
         <w:ind w:left="0" w:right="0" w:firstLine="0"/>
+        <w:contextualSpacing/>
         <w:jc w:val="center"/>
         <w:rPr>
           <w:sz w:val="28"/>
@@ -103,8 +108,9 @@
     </w:p>
     <w:p>
       <w:pPr>
-        <w:spacing w:after="0" w:line="324" w:lineRule="auto"/>
+        <w:spacing w:after="0" w:line="312" w:lineRule="auto"/>
         <w:ind w:left="0" w:right="0" w:firstLine="0"/>
+        <w:contextualSpacing/>
         <w:jc w:val="center"/>
         <w:rPr>
           <w:sz w:val="28"/>
@@ -114,8 +120,9 @@
     </w:p>
     <w:p>
       <w:pPr>
-        <w:spacing w:after="0" w:line="324" w:lineRule="auto"/>
+        <w:spacing w:after="0" w:line="312" w:lineRule="auto"/>
         <w:ind w:left="0" w:right="0" w:firstLine="0"/>
+        <w:contextualSpacing/>
         <w:jc w:val="center"/>
         <w:rPr>
           <w:sz w:val="28"/>
@@ -125,8 +132,9 @@
     </w:p>
     <w:p>
       <w:pPr>
-        <w:spacing w:after="0" w:line="324" w:lineRule="auto"/>
+        <w:spacing w:after="0" w:line="312" w:lineRule="auto"/>
         <w:ind w:left="0" w:right="0" w:firstLine="0"/>
+        <w:contextualSpacing/>
         <w:jc w:val="center"/>
         <w:rPr>
           <w:sz w:val="28"/>
@@ -136,8 +144,9 @@
     </w:p>
     <w:p>
       <w:pPr>
-        <w:spacing w:after="0" w:line="324" w:lineRule="auto"/>
+        <w:spacing w:after="0" w:line="312" w:lineRule="auto"/>
         <w:ind w:left="0" w:right="0" w:firstLine="0"/>
+        <w:contextualSpacing/>
         <w:jc w:val="center"/>
         <w:rPr>
           <w:sz w:val="28"/>
@@ -152,8 +161,9 @@
           <w:ilvl w:val="0"/>
           <w:numId w:val="0"/>
         </w:numPr>
-        <w:spacing w:line="324" w:lineRule="auto"/>
+        <w:spacing w:line="312" w:lineRule="auto"/>
         <w:ind w:right="0"/>
+        <w:contextualSpacing/>
         <w:rPr>
           <w:sz w:val="28"/>
           <w:szCs w:val="28"/>
@@ -169,8 +179,9 @@
     </w:p>
     <w:p>
       <w:pPr>
-        <w:spacing w:after="0" w:line="324" w:lineRule="auto"/>
+        <w:spacing w:after="0" w:line="312" w:lineRule="auto"/>
         <w:ind w:left="0" w:right="0" w:firstLine="0"/>
+        <w:contextualSpacing/>
         <w:jc w:val="center"/>
         <w:rPr>
           <w:sz w:val="28"/>
@@ -187,8 +198,9 @@
     </w:p>
     <w:p>
       <w:pPr>
-        <w:spacing w:after="0" w:line="324" w:lineRule="auto"/>
+        <w:spacing w:after="0" w:line="312" w:lineRule="auto"/>
         <w:ind w:left="0" w:right="0" w:firstLine="0"/>
+        <w:contextualSpacing/>
         <w:jc w:val="center"/>
         <w:rPr>
           <w:sz w:val="28"/>
@@ -219,8 +231,9 @@
     </w:p>
     <w:p>
       <w:pPr>
-        <w:spacing w:after="0" w:line="324" w:lineRule="auto"/>
+        <w:spacing w:after="0" w:line="312" w:lineRule="auto"/>
         <w:ind w:left="0" w:right="0" w:firstLine="0"/>
+        <w:contextualSpacing/>
         <w:jc w:val="center"/>
         <w:rPr>
           <w:sz w:val="28"/>
@@ -258,8 +271,9 @@
     </w:p>
     <w:p>
       <w:pPr>
-        <w:spacing w:after="0" w:line="324" w:lineRule="auto"/>
+        <w:spacing w:after="0" w:line="312" w:lineRule="auto"/>
         <w:ind w:left="0" w:right="0" w:firstLine="0"/>
+        <w:contextualSpacing/>
         <w:jc w:val="center"/>
         <w:rPr>
           <w:sz w:val="28"/>
@@ -274,8 +288,9 @@
           <w:ilvl w:val="0"/>
           <w:numId w:val="0"/>
         </w:numPr>
-        <w:spacing w:line="324" w:lineRule="auto"/>
+        <w:spacing w:line="312" w:lineRule="auto"/>
         <w:ind w:right="0"/>
+        <w:contextualSpacing/>
         <w:rPr>
           <w:sz w:val="28"/>
           <w:szCs w:val="28"/>
@@ -291,8 +306,9 @@
     </w:p>
     <w:p>
       <w:pPr>
-        <w:spacing w:after="0" w:line="324" w:lineRule="auto"/>
+        <w:spacing w:after="0" w:line="312" w:lineRule="auto"/>
         <w:ind w:left="0" w:right="0" w:firstLine="0"/>
+        <w:contextualSpacing/>
         <w:jc w:val="center"/>
         <w:rPr>
           <w:sz w:val="28"/>
@@ -330,8 +346,9 @@
     </w:p>
     <w:p>
       <w:pPr>
-        <w:spacing w:after="0" w:line="324" w:lineRule="auto"/>
+        <w:spacing w:after="0" w:line="312" w:lineRule="auto"/>
         <w:ind w:left="0" w:right="0" w:firstLine="0"/>
+        <w:contextualSpacing/>
         <w:jc w:val="center"/>
         <w:rPr>
           <w:sz w:val="28"/>
@@ -348,8 +365,9 @@
     </w:p>
     <w:p>
       <w:pPr>
-        <w:spacing w:after="0" w:line="324" w:lineRule="auto"/>
+        <w:spacing w:after="0" w:line="312" w:lineRule="auto"/>
         <w:ind w:left="0" w:right="0" w:firstLine="0"/>
+        <w:contextualSpacing/>
         <w:jc w:val="center"/>
         <w:rPr>
           <w:sz w:val="28"/>
@@ -359,8 +377,9 @@
     </w:p>
     <w:p>
       <w:pPr>
-        <w:spacing w:after="0" w:line="324" w:lineRule="auto"/>
+        <w:spacing w:after="0" w:line="312" w:lineRule="auto"/>
         <w:ind w:left="0" w:right="0" w:firstLine="0"/>
+        <w:contextualSpacing/>
         <w:jc w:val="center"/>
         <w:rPr>
           <w:sz w:val="28"/>
@@ -370,8 +389,9 @@
     </w:p>
     <w:p>
       <w:pPr>
-        <w:spacing w:after="0" w:line="324" w:lineRule="auto"/>
+        <w:spacing w:after="0" w:line="312" w:lineRule="auto"/>
         <w:ind w:left="0" w:right="0" w:firstLine="0"/>
+        <w:contextualSpacing/>
         <w:jc w:val="center"/>
         <w:rPr>
           <w:sz w:val="28"/>
@@ -381,8 +401,9 @@
     </w:p>
     <w:p>
       <w:pPr>
-        <w:spacing w:after="0" w:line="324" w:lineRule="auto"/>
+        <w:spacing w:after="0" w:line="312" w:lineRule="auto"/>
         <w:ind w:left="0" w:right="0" w:firstLine="0"/>
+        <w:contextualSpacing/>
         <w:jc w:val="center"/>
         <w:rPr>
           <w:sz w:val="28"/>
@@ -392,8 +413,9 @@
     </w:p>
     <w:p>
       <w:pPr>
-        <w:spacing w:after="0" w:line="324" w:lineRule="auto"/>
+        <w:spacing w:after="0" w:line="312" w:lineRule="auto"/>
         <w:ind w:left="0" w:right="0"/>
+        <w:contextualSpacing/>
         <w:jc w:val="left"/>
         <w:rPr>
           <w:sz w:val="28"/>
@@ -403,8 +425,9 @@
     </w:p>
     <w:p>
       <w:pPr>
-        <w:spacing w:after="0" w:line="324" w:lineRule="auto"/>
+        <w:spacing w:after="0" w:line="312" w:lineRule="auto"/>
         <w:ind w:left="0" w:right="0"/>
+        <w:contextualSpacing/>
         <w:rPr>
           <w:sz w:val="28"/>
           <w:szCs w:val="28"/>
@@ -450,8 +473,9 @@
     </w:p>
     <w:p>
       <w:pPr>
-        <w:spacing w:after="0" w:line="324" w:lineRule="auto"/>
+        <w:spacing w:after="0" w:line="312" w:lineRule="auto"/>
         <w:ind w:left="0" w:right="0" w:firstLine="0"/>
+        <w:contextualSpacing/>
         <w:jc w:val="left"/>
         <w:rPr>
           <w:sz w:val="28"/>
@@ -461,8 +485,9 @@
     </w:p>
     <w:p>
       <w:pPr>
-        <w:spacing w:after="0" w:line="324" w:lineRule="auto"/>
+        <w:spacing w:after="0" w:line="312" w:lineRule="auto"/>
         <w:ind w:left="0" w:right="0"/>
+        <w:contextualSpacing/>
         <w:rPr>
           <w:sz w:val="28"/>
           <w:szCs w:val="28"/>
@@ -485,8 +510,9 @@
     </w:p>
     <w:p>
       <w:pPr>
-        <w:spacing w:after="0" w:line="324" w:lineRule="auto"/>
+        <w:spacing w:after="0" w:line="312" w:lineRule="auto"/>
         <w:ind w:left="0" w:right="0" w:firstLine="0"/>
+        <w:contextualSpacing/>
         <w:jc w:val="center"/>
         <w:rPr>
           <w:sz w:val="28"/>
@@ -496,8 +522,9 @@
     </w:p>
     <w:p>
       <w:pPr>
-        <w:spacing w:after="0" w:line="324" w:lineRule="auto"/>
+        <w:spacing w:after="0" w:line="312" w:lineRule="auto"/>
         <w:ind w:left="0" w:right="0" w:firstLine="0"/>
+        <w:contextualSpacing/>
         <w:jc w:val="center"/>
         <w:rPr>
           <w:sz w:val="28"/>
@@ -507,8 +534,9 @@
     </w:p>
     <w:p>
       <w:pPr>
-        <w:spacing w:after="0" w:line="324" w:lineRule="auto"/>
+        <w:spacing w:after="0" w:line="312" w:lineRule="auto"/>
         <w:ind w:left="0" w:right="0" w:firstLine="0"/>
+        <w:contextualSpacing/>
         <w:jc w:val="center"/>
         <w:rPr>
           <w:sz w:val="28"/>
@@ -518,8 +546,9 @@
     </w:p>
     <w:p>
       <w:pPr>
-        <w:spacing w:after="0" w:line="324" w:lineRule="auto"/>
+        <w:spacing w:after="0" w:line="312" w:lineRule="auto"/>
         <w:ind w:left="0" w:right="0" w:firstLine="0"/>
+        <w:contextualSpacing/>
         <w:jc w:val="center"/>
         <w:rPr>
           <w:sz w:val="28"/>
@@ -529,8 +558,33 @@
     </w:p>
     <w:p>
       <w:pPr>
-        <w:spacing w:after="0" w:line="324" w:lineRule="auto"/>
+        <w:spacing w:after="0" w:line="312" w:lineRule="auto"/>
+        <w:ind w:left="0" w:right="0" w:firstLine="0"/>
+        <w:contextualSpacing/>
+        <w:jc w:val="center"/>
+        <w:rPr>
+          <w:sz w:val="28"/>
+          <w:szCs w:val="28"/>
+        </w:rPr>
+      </w:pPr>
+    </w:p>
+    <w:p>
+      <w:pPr>
+        <w:spacing w:after="0" w:line="312" w:lineRule="auto"/>
+        <w:ind w:left="0" w:right="0" w:firstLine="0"/>
+        <w:contextualSpacing/>
+        <w:jc w:val="center"/>
+        <w:rPr>
+          <w:sz w:val="28"/>
+          <w:szCs w:val="28"/>
+        </w:rPr>
+      </w:pPr>
+    </w:p>
+    <w:p>
+      <w:pPr>
+        <w:spacing w:after="0" w:line="312" w:lineRule="auto"/>
         <w:ind w:left="0" w:right="0"/>
+        <w:contextualSpacing/>
         <w:jc w:val="center"/>
         <w:rPr>
           <w:sz w:val="28"/>
@@ -559,8 +613,9 @@
           <w:ilvl w:val="0"/>
           <w:numId w:val="0"/>
         </w:numPr>
-        <w:spacing w:line="324" w:lineRule="auto"/>
+        <w:spacing w:line="312" w:lineRule="auto"/>
         <w:ind w:right="0"/>
+        <w:contextualSpacing/>
         <w:rPr>
           <w:sz w:val="28"/>
           <w:szCs w:val="28"/>
@@ -577,14 +632,16 @@
     </w:p>
     <w:p>
       <w:pPr>
-        <w:spacing w:after="0"/>
+        <w:spacing w:after="0" w:line="312" w:lineRule="auto"/>
         <w:ind w:left="0" w:right="0"/>
-      </w:pPr>
-    </w:p>
-    <w:p>
-      <w:pPr>
-        <w:spacing w:after="0" w:line="324" w:lineRule="auto"/>
+        <w:contextualSpacing/>
+      </w:pPr>
+    </w:p>
+    <w:p>
+      <w:pPr>
+        <w:spacing w:after="0" w:line="312" w:lineRule="auto"/>
         <w:ind w:left="0" w:right="0" w:firstLine="0"/>
+        <w:contextualSpacing/>
         <w:jc w:val="center"/>
         <w:rPr>
           <w:sz w:val="28"/>
@@ -602,8 +659,9 @@
     </w:p>
     <w:p>
       <w:pPr>
-        <w:spacing w:after="0" w:line="324" w:lineRule="auto"/>
+        <w:spacing w:after="0" w:line="312" w:lineRule="auto"/>
         <w:ind w:left="0" w:right="0" w:firstLine="0"/>
+        <w:contextualSpacing/>
         <w:jc w:val="center"/>
         <w:rPr>
           <w:sz w:val="28"/>
@@ -613,8 +671,9 @@
     </w:p>
     <w:p>
       <w:pPr>
-        <w:spacing w:line="324" w:lineRule="auto"/>
+        <w:spacing w:line="312" w:lineRule="auto"/>
         <w:ind w:left="5040" w:firstLine="720"/>
+        <w:contextualSpacing/>
         <w:rPr>
           <w:b/>
           <w:sz w:val="28"/>
@@ -633,8 +692,9 @@
     <w:p>
       <w:pPr>
         <w:pStyle w:val="a6"/>
-        <w:spacing w:line="324" w:lineRule="auto"/>
+        <w:spacing w:line="312" w:lineRule="auto"/>
         <w:ind w:left="5760"/>
+        <w:contextualSpacing/>
         <w:rPr>
           <w:sz w:val="28"/>
           <w:szCs w:val="28"/>
@@ -686,8 +746,9 @@
     <w:p>
       <w:pPr>
         <w:pStyle w:val="a6"/>
-        <w:spacing w:line="324" w:lineRule="auto"/>
+        <w:spacing w:line="312" w:lineRule="auto"/>
         <w:ind w:left="5040" w:firstLine="720"/>
+        <w:contextualSpacing/>
         <w:rPr>
           <w:sz w:val="28"/>
           <w:szCs w:val="28"/>
@@ -718,8 +779,9 @@
     <w:p>
       <w:pPr>
         <w:pStyle w:val="a6"/>
-        <w:spacing w:line="324" w:lineRule="auto"/>
+        <w:spacing w:line="312" w:lineRule="auto"/>
         <w:ind w:left="5040" w:firstLine="720"/>
+        <w:contextualSpacing/>
         <w:rPr>
           <w:b/>
           <w:sz w:val="28"/>
@@ -754,8 +816,9 @@
     <w:p>
       <w:pPr>
         <w:pStyle w:val="a6"/>
-        <w:spacing w:line="324" w:lineRule="auto"/>
+        <w:spacing w:line="312" w:lineRule="auto"/>
         <w:ind w:left="5040" w:firstLine="720"/>
+        <w:contextualSpacing/>
         <w:rPr>
           <w:sz w:val="28"/>
           <w:szCs w:val="28"/>
@@ -829,8 +892,9 @@
     </w:p>
     <w:p>
       <w:pPr>
-        <w:spacing w:after="0" w:line="324" w:lineRule="auto"/>
+        <w:spacing w:after="0" w:line="312" w:lineRule="auto"/>
         <w:ind w:left="0" w:right="0" w:firstLine="0"/>
+        <w:contextualSpacing/>
         <w:jc w:val="center"/>
         <w:rPr>
           <w:sz w:val="28"/>
@@ -840,8 +904,9 @@
     </w:p>
     <w:p>
       <w:pPr>
-        <w:spacing w:after="0" w:line="324" w:lineRule="auto"/>
+        <w:spacing w:after="0" w:line="312" w:lineRule="auto"/>
         <w:ind w:left="0" w:right="0" w:firstLine="0"/>
+        <w:contextualSpacing/>
         <w:jc w:val="center"/>
         <w:rPr>
           <w:b/>
@@ -860,8 +925,9 @@
     </w:p>
     <w:p>
       <w:pPr>
-        <w:spacing w:after="0" w:line="324" w:lineRule="auto"/>
+        <w:spacing w:after="0" w:line="312" w:lineRule="auto"/>
         <w:ind w:left="0" w:right="0" w:firstLine="709"/>
+        <w:contextualSpacing/>
         <w:rPr>
           <w:b/>
           <w:sz w:val="28"/>
@@ -879,8 +945,9 @@
     </w:p>
     <w:p>
       <w:pPr>
-        <w:spacing w:after="0" w:line="324" w:lineRule="auto"/>
+        <w:spacing w:after="0" w:line="312" w:lineRule="auto"/>
         <w:ind w:left="0" w:right="0" w:firstLine="709"/>
+        <w:contextualSpacing/>
         <w:rPr>
           <w:bCs/>
           <w:sz w:val="28"/>
@@ -898,8 +965,9 @@
     </w:p>
     <w:p>
       <w:pPr>
-        <w:spacing w:after="0" w:line="324" w:lineRule="auto"/>
+        <w:spacing w:after="0" w:line="312" w:lineRule="auto"/>
         <w:ind w:left="0" w:right="0" w:firstLine="709"/>
+        <w:contextualSpacing/>
         <w:rPr>
           <w:bCs/>
           <w:sz w:val="28"/>
@@ -917,8 +985,9 @@
     </w:p>
     <w:p>
       <w:pPr>
-        <w:spacing w:after="0" w:line="324" w:lineRule="auto"/>
+        <w:spacing w:after="0" w:line="312" w:lineRule="auto"/>
         <w:ind w:left="0" w:right="0" w:firstLine="709"/>
+        <w:contextualSpacing/>
         <w:rPr>
           <w:b/>
           <w:sz w:val="28"/>
@@ -944,8 +1013,9 @@
     </w:p>
     <w:p>
       <w:pPr>
-        <w:spacing w:after="0" w:line="324" w:lineRule="auto"/>
+        <w:spacing w:after="0" w:line="312" w:lineRule="auto"/>
         <w:ind w:left="0" w:right="0" w:firstLine="709"/>
+        <w:contextualSpacing/>
         <w:rPr>
           <w:bCs/>
           <w:sz w:val="28"/>
@@ -968,7 +1038,7 @@
           <w:ilvl w:val="0"/>
           <w:numId w:val="19"/>
         </w:numPr>
-        <w:spacing w:after="0" w:line="324" w:lineRule="auto"/>
+        <w:spacing w:after="0" w:line="312" w:lineRule="auto"/>
         <w:ind w:left="0" w:right="0" w:firstLine="709"/>
         <w:rPr>
           <w:bCs/>
@@ -992,7 +1062,7 @@
           <w:ilvl w:val="0"/>
           <w:numId w:val="19"/>
         </w:numPr>
-        <w:spacing w:after="0" w:line="324" w:lineRule="auto"/>
+        <w:spacing w:after="0" w:line="312" w:lineRule="auto"/>
         <w:ind w:left="0" w:right="0" w:firstLine="709"/>
         <w:rPr>
           <w:bCs/>
@@ -1016,7 +1086,7 @@
           <w:ilvl w:val="0"/>
           <w:numId w:val="19"/>
         </w:numPr>
-        <w:spacing w:after="0" w:line="324" w:lineRule="auto"/>
+        <w:spacing w:after="0" w:line="312" w:lineRule="auto"/>
         <w:ind w:left="0" w:right="0" w:firstLine="709"/>
         <w:rPr>
           <w:bCs/>
@@ -1040,7 +1110,7 @@
           <w:ilvl w:val="0"/>
           <w:numId w:val="19"/>
         </w:numPr>
-        <w:spacing w:after="0" w:line="324" w:lineRule="auto"/>
+        <w:spacing w:after="0" w:line="312" w:lineRule="auto"/>
         <w:ind w:left="0" w:right="0" w:firstLine="709"/>
         <w:rPr>
           <w:bCs/>
@@ -1054,33 +1124,35 @@
           <w:sz w:val="28"/>
           <w:szCs w:val="28"/>
         </w:rPr>
+        <w:t>предоставления отчетов о выполнении услуг.</w:t>
+      </w:r>
+    </w:p>
+    <w:p>
+      <w:pPr>
+        <w:spacing w:after="0" w:line="312" w:lineRule="auto"/>
+        <w:ind w:left="0" w:right="0" w:firstLine="709"/>
+        <w:contextualSpacing/>
+        <w:rPr>
+          <w:b/>
+          <w:sz w:val="28"/>
+          <w:szCs w:val="28"/>
+        </w:rPr>
+      </w:pPr>
+      <w:r>
+        <w:rPr>
+          <w:b/>
+          <w:sz w:val="28"/>
+          <w:szCs w:val="28"/>
+        </w:rPr>
         <w:lastRenderedPageBreak/>
-        <w:t>предоставления отчетов о выполнении услуг.</w:t>
-      </w:r>
-    </w:p>
-    <w:p>
-      <w:pPr>
-        <w:spacing w:after="0" w:line="324" w:lineRule="auto"/>
+        <w:t>3 Требования к программе или программному изделию</w:t>
+      </w:r>
+    </w:p>
+    <w:p>
+      <w:pPr>
+        <w:spacing w:after="0" w:line="312" w:lineRule="auto"/>
         <w:ind w:left="0" w:right="0" w:firstLine="709"/>
-        <w:rPr>
-          <w:b/>
-          <w:sz w:val="28"/>
-          <w:szCs w:val="28"/>
-        </w:rPr>
-      </w:pPr>
-      <w:r>
-        <w:rPr>
-          <w:b/>
-          <w:sz w:val="28"/>
-          <w:szCs w:val="28"/>
-        </w:rPr>
-        <w:t>3 Требования к программе или программному изделию</w:t>
-      </w:r>
-    </w:p>
-    <w:p>
-      <w:pPr>
-        <w:spacing w:after="0" w:line="324" w:lineRule="auto"/>
-        <w:ind w:left="0" w:right="0" w:firstLine="709"/>
+        <w:contextualSpacing/>
         <w:rPr>
           <w:i/>
           <w:iCs/>
@@ -1108,8 +1180,9 @@
           <w:tab w:val="clear" w:pos="720"/>
           <w:tab w:val="num" w:pos="1134"/>
         </w:tabs>
-        <w:spacing w:after="0" w:line="324" w:lineRule="auto"/>
+        <w:spacing w:after="0" w:line="312" w:lineRule="auto"/>
         <w:ind w:left="0" w:right="0" w:firstLine="709"/>
+        <w:contextualSpacing/>
         <w:rPr>
           <w:bCs/>
           <w:sz w:val="28"/>
@@ -1135,8 +1208,9 @@
           <w:tab w:val="clear" w:pos="720"/>
           <w:tab w:val="num" w:pos="1134"/>
         </w:tabs>
-        <w:spacing w:after="0" w:line="324" w:lineRule="auto"/>
+        <w:spacing w:after="0" w:line="312" w:lineRule="auto"/>
         <w:ind w:left="0" w:right="0" w:firstLine="709"/>
+        <w:contextualSpacing/>
         <w:rPr>
           <w:bCs/>
           <w:sz w:val="28"/>
@@ -1162,8 +1236,9 @@
           <w:tab w:val="clear" w:pos="720"/>
           <w:tab w:val="num" w:pos="1134"/>
         </w:tabs>
-        <w:spacing w:after="0" w:line="324" w:lineRule="auto"/>
+        <w:spacing w:after="0" w:line="312" w:lineRule="auto"/>
         <w:ind w:left="0" w:right="0" w:firstLine="709"/>
+        <w:contextualSpacing/>
         <w:rPr>
           <w:bCs/>
           <w:sz w:val="28"/>
@@ -1189,8 +1264,9 @@
           <w:tab w:val="clear" w:pos="720"/>
           <w:tab w:val="num" w:pos="1134"/>
         </w:tabs>
-        <w:spacing w:after="0" w:line="324" w:lineRule="auto"/>
+        <w:spacing w:after="0" w:line="312" w:lineRule="auto"/>
         <w:ind w:left="0" w:right="0" w:firstLine="709"/>
+        <w:contextualSpacing/>
         <w:rPr>
           <w:bCs/>
           <w:sz w:val="28"/>
@@ -1216,8 +1292,9 @@
           <w:tab w:val="clear" w:pos="720"/>
           <w:tab w:val="num" w:pos="1134"/>
         </w:tabs>
-        <w:spacing w:after="0" w:line="324" w:lineRule="auto"/>
+        <w:spacing w:after="0" w:line="312" w:lineRule="auto"/>
         <w:ind w:left="0" w:right="0" w:firstLine="709"/>
+        <w:contextualSpacing/>
         <w:rPr>
           <w:bCs/>
           <w:sz w:val="28"/>
@@ -1235,8 +1312,9 @@
     </w:p>
     <w:p>
       <w:pPr>
-        <w:spacing w:after="0" w:line="324" w:lineRule="auto"/>
+        <w:spacing w:after="0" w:line="312" w:lineRule="auto"/>
         <w:ind w:left="0" w:right="0" w:firstLine="709"/>
+        <w:contextualSpacing/>
         <w:rPr>
           <w:i/>
           <w:iCs/>
@@ -1264,8 +1342,9 @@
           <w:tab w:val="clear" w:pos="720"/>
           <w:tab w:val="num" w:pos="1134"/>
         </w:tabs>
-        <w:spacing w:after="0" w:line="324" w:lineRule="auto"/>
+        <w:spacing w:after="0" w:line="312" w:lineRule="auto"/>
         <w:ind w:left="0" w:right="0" w:firstLine="709"/>
+        <w:contextualSpacing/>
         <w:rPr>
           <w:bCs/>
           <w:sz w:val="28"/>
@@ -1291,8 +1370,9 @@
           <w:tab w:val="clear" w:pos="720"/>
           <w:tab w:val="num" w:pos="1134"/>
         </w:tabs>
-        <w:spacing w:after="0" w:line="324" w:lineRule="auto"/>
+        <w:spacing w:after="0" w:line="312" w:lineRule="auto"/>
         <w:ind w:left="0" w:right="0" w:firstLine="709"/>
+        <w:contextualSpacing/>
         <w:rPr>
           <w:bCs/>
           <w:sz w:val="28"/>
@@ -1318,8 +1398,9 @@
           <w:tab w:val="clear" w:pos="720"/>
           <w:tab w:val="num" w:pos="1134"/>
         </w:tabs>
-        <w:spacing w:after="0" w:line="324" w:lineRule="auto"/>
+        <w:spacing w:after="0" w:line="312" w:lineRule="auto"/>
         <w:ind w:left="0" w:right="0" w:firstLine="709"/>
+        <w:contextualSpacing/>
         <w:rPr>
           <w:bCs/>
           <w:sz w:val="28"/>
@@ -1337,8 +1418,9 @@
     </w:p>
     <w:p>
       <w:pPr>
-        <w:spacing w:after="0" w:line="324" w:lineRule="auto"/>
+        <w:spacing w:after="0" w:line="312" w:lineRule="auto"/>
         <w:ind w:left="0" w:right="0" w:firstLine="709"/>
+        <w:contextualSpacing/>
         <w:rPr>
           <w:i/>
           <w:iCs/>
@@ -1366,8 +1448,9 @@
           <w:tab w:val="clear" w:pos="720"/>
           <w:tab w:val="num" w:pos="1134"/>
         </w:tabs>
-        <w:spacing w:after="0" w:line="324" w:lineRule="auto"/>
+        <w:spacing w:after="0" w:line="312" w:lineRule="auto"/>
         <w:ind w:left="0" w:right="0" w:firstLine="709"/>
+        <w:contextualSpacing/>
         <w:rPr>
           <w:bCs/>
           <w:sz w:val="28"/>
@@ -1393,8 +1476,9 @@
           <w:tab w:val="clear" w:pos="720"/>
           <w:tab w:val="num" w:pos="1134"/>
         </w:tabs>
-        <w:spacing w:after="0" w:line="324" w:lineRule="auto"/>
+        <w:spacing w:after="0" w:line="312" w:lineRule="auto"/>
         <w:ind w:left="0" w:right="0" w:firstLine="709"/>
+        <w:contextualSpacing/>
         <w:rPr>
           <w:bCs/>
           <w:sz w:val="28"/>
@@ -1412,8 +1496,9 @@
     </w:p>
     <w:p>
       <w:pPr>
-        <w:spacing w:after="0" w:line="324" w:lineRule="auto"/>
+        <w:spacing w:after="0" w:line="312" w:lineRule="auto"/>
         <w:ind w:left="0" w:right="0" w:firstLine="709"/>
+        <w:contextualSpacing/>
         <w:rPr>
           <w:i/>
           <w:iCs/>
@@ -1441,8 +1526,9 @@
           <w:tab w:val="clear" w:pos="720"/>
           <w:tab w:val="num" w:pos="1134"/>
         </w:tabs>
-        <w:spacing w:after="0" w:line="324" w:lineRule="auto"/>
+        <w:spacing w:after="0" w:line="312" w:lineRule="auto"/>
         <w:ind w:left="0" w:right="0" w:firstLine="709"/>
+        <w:contextualSpacing/>
         <w:rPr>
           <w:bCs/>
           <w:sz w:val="28"/>
@@ -1468,8 +1554,9 @@
           <w:tab w:val="clear" w:pos="720"/>
           <w:tab w:val="num" w:pos="1134"/>
         </w:tabs>
-        <w:spacing w:after="0" w:line="324" w:lineRule="auto"/>
+        <w:spacing w:after="0" w:line="312" w:lineRule="auto"/>
         <w:ind w:left="0" w:right="0" w:firstLine="709"/>
+        <w:contextualSpacing/>
         <w:rPr>
           <w:bCs/>
           <w:sz w:val="28"/>
@@ -1487,8 +1574,9 @@
     </w:p>
     <w:p>
       <w:pPr>
-        <w:spacing w:after="0" w:line="324" w:lineRule="auto"/>
+        <w:spacing w:after="0" w:line="312" w:lineRule="auto"/>
         <w:ind w:left="0" w:right="0" w:firstLine="709"/>
+        <w:contextualSpacing/>
         <w:rPr>
           <w:b/>
           <w:sz w:val="28"/>
@@ -1519,7 +1607,7 @@
           <w:ilvl w:val="0"/>
           <w:numId w:val="28"/>
         </w:numPr>
-        <w:spacing w:after="0" w:line="324" w:lineRule="auto"/>
+        <w:spacing w:after="0" w:line="312" w:lineRule="auto"/>
         <w:ind w:left="0" w:right="0" w:firstLine="709"/>
         <w:rPr>
           <w:bCs/>
@@ -1543,7 +1631,7 @@
           <w:ilvl w:val="0"/>
           <w:numId w:val="28"/>
         </w:numPr>
-        <w:spacing w:after="0" w:line="324" w:lineRule="auto"/>
+        <w:spacing w:after="0" w:line="312" w:lineRule="auto"/>
         <w:ind w:left="0" w:right="0" w:firstLine="709"/>
         <w:rPr>
           <w:bCs/>
@@ -1562,8 +1650,9 @@
     </w:p>
     <w:p>
       <w:pPr>
-        <w:spacing w:after="0" w:line="324" w:lineRule="auto"/>
+        <w:spacing w:after="0" w:line="312" w:lineRule="auto"/>
         <w:ind w:left="0" w:right="0" w:firstLine="709"/>
+        <w:contextualSpacing/>
         <w:rPr>
           <w:bCs/>
           <w:sz w:val="28"/>
@@ -1581,8 +1670,9 @@
     </w:p>
     <w:p>
       <w:pPr>
-        <w:spacing w:after="0" w:line="324" w:lineRule="auto"/>
+        <w:spacing w:after="0" w:line="312" w:lineRule="auto"/>
         <w:ind w:left="0" w:right="0" w:firstLine="709"/>
+        <w:contextualSpacing/>
         <w:rPr>
           <w:bCs/>
           <w:sz w:val="28"/>
@@ -1600,8 +1690,9 @@
     </w:p>
     <w:p>
       <w:pPr>
-        <w:spacing w:after="0" w:line="324" w:lineRule="auto"/>
+        <w:spacing w:after="0" w:line="312" w:lineRule="auto"/>
         <w:ind w:left="0" w:right="0" w:firstLine="709"/>
+        <w:contextualSpacing/>
         <w:rPr>
           <w:b/>
           <w:sz w:val="28"/>
@@ -1619,8 +1710,9 @@
     </w:p>
     <w:p>
       <w:pPr>
-        <w:spacing w:after="0" w:line="324" w:lineRule="auto"/>
+        <w:spacing w:after="0" w:line="312" w:lineRule="auto"/>
         <w:ind w:left="0" w:right="0" w:firstLine="709"/>
+        <w:contextualSpacing/>
         <w:rPr>
           <w:bCs/>
           <w:i/>
@@ -1662,8 +1754,9 @@
     </w:p>
     <w:p>
       <w:pPr>
-        <w:spacing w:after="0" w:line="324" w:lineRule="auto"/>
+        <w:spacing w:after="0" w:line="312" w:lineRule="auto"/>
         <w:ind w:left="0" w:right="0" w:firstLine="709"/>
+        <w:contextualSpacing/>
         <w:rPr>
           <w:bCs/>
           <w:sz w:val="28"/>
@@ -1686,7 +1779,7 @@
           <w:ilvl w:val="0"/>
           <w:numId w:val="28"/>
         </w:numPr>
-        <w:spacing w:after="0" w:line="324" w:lineRule="auto"/>
+        <w:spacing w:after="0" w:line="312" w:lineRule="auto"/>
         <w:ind w:left="0" w:right="0" w:firstLine="709"/>
         <w:rPr>
           <w:bCs/>
@@ -1711,7 +1804,7 @@
           <w:ilvl w:val="0"/>
           <w:numId w:val="28"/>
         </w:numPr>
-        <w:spacing w:after="0" w:line="324" w:lineRule="auto"/>
+        <w:spacing w:after="0" w:line="312" w:lineRule="auto"/>
         <w:ind w:left="0" w:right="0" w:firstLine="709"/>
         <w:rPr>
           <w:bCs/>
@@ -1735,7 +1828,7 @@
           <w:ilvl w:val="0"/>
           <w:numId w:val="28"/>
         </w:numPr>
-        <w:spacing w:after="0" w:line="324" w:lineRule="auto"/>
+        <w:spacing w:after="0" w:line="312" w:lineRule="auto"/>
         <w:ind w:left="0" w:right="0" w:firstLine="709"/>
         <w:rPr>
           <w:bCs/>
@@ -1813,7 +1906,7 @@
           <w:ilvl w:val="0"/>
           <w:numId w:val="28"/>
         </w:numPr>
-        <w:spacing w:after="0" w:line="324" w:lineRule="auto"/>
+        <w:spacing w:after="0" w:line="312" w:lineRule="auto"/>
         <w:ind w:left="0" w:right="0" w:firstLine="709"/>
         <w:rPr>
           <w:bCs/>
@@ -1837,7 +1930,7 @@
           <w:ilvl w:val="0"/>
           <w:numId w:val="28"/>
         </w:numPr>
-        <w:spacing w:after="0" w:line="324" w:lineRule="auto"/>
+        <w:spacing w:after="0" w:line="312" w:lineRule="auto"/>
         <w:ind w:left="0" w:right="0" w:firstLine="709"/>
         <w:rPr>
           <w:bCs/>
@@ -1857,7 +1950,7 @@
     <w:p>
       <w:pPr>
         <w:pStyle w:val="a3"/>
-        <w:spacing w:after="0" w:line="324" w:lineRule="auto"/>
+        <w:spacing w:after="0" w:line="312" w:lineRule="auto"/>
         <w:ind w:left="709" w:right="0" w:firstLine="0"/>
         <w:rPr>
           <w:bCs/>
@@ -1885,7 +1978,7 @@
           <w:ilvl w:val="0"/>
           <w:numId w:val="29"/>
         </w:numPr>
-        <w:spacing w:after="0" w:line="324" w:lineRule="auto"/>
+        <w:spacing w:after="0" w:line="312" w:lineRule="auto"/>
         <w:ind w:left="0" w:right="0" w:firstLine="709"/>
         <w:rPr>
           <w:bCs/>
@@ -1907,24 +2000,8 @@
           <w:sz w:val="28"/>
           <w:szCs w:val="28"/>
         </w:rPr>
-        <w:t>:</w:t>
-      </w:r>
-    </w:p>
-    <w:p>
-      <w:pPr>
-        <w:pStyle w:val="a3"/>
-        <w:numPr>
-          <w:ilvl w:val="1"/>
-          <w:numId w:val="30"/>
-        </w:numPr>
-        <w:spacing w:after="0" w:line="324" w:lineRule="auto"/>
-        <w:ind w:left="0" w:right="0" w:firstLine="1418"/>
-        <w:rPr>
-          <w:bCs/>
-          <w:sz w:val="28"/>
-          <w:szCs w:val="28"/>
-        </w:rPr>
-      </w:pPr>
+        <w:t xml:space="preserve">. </w:t>
+      </w:r>
       <w:r>
         <w:rPr>
           <w:bCs/>
@@ -1933,22 +2010,14 @@
         </w:rPr>
         <w:t>Преимущества: четкая структура, этапы разработки строго определены, хорошо подходит для проектов с фиксированными требованиями.</w:t>
       </w:r>
-    </w:p>
-    <w:p>
-      <w:pPr>
-        <w:pStyle w:val="a3"/>
-        <w:numPr>
-          <w:ilvl w:val="1"/>
-          <w:numId w:val="30"/>
-        </w:numPr>
-        <w:spacing w:after="0" w:line="324" w:lineRule="auto"/>
-        <w:ind w:left="0" w:right="0" w:firstLine="1418"/>
-        <w:rPr>
-          <w:bCs/>
-          <w:sz w:val="28"/>
-          <w:szCs w:val="28"/>
-        </w:rPr>
-      </w:pPr>
+      <w:r>
+        <w:rPr>
+          <w:bCs/>
+          <w:sz w:val="28"/>
+          <w:szCs w:val="28"/>
+        </w:rPr>
+        <w:t xml:space="preserve"> </w:t>
+      </w:r>
       <w:r>
         <w:rPr>
           <w:bCs/>
@@ -1965,7 +2034,7 @@
           <w:ilvl w:val="0"/>
           <w:numId w:val="30"/>
         </w:numPr>
-        <w:spacing w:after="0" w:line="324" w:lineRule="auto"/>
+        <w:spacing w:after="0" w:line="312" w:lineRule="auto"/>
         <w:ind w:left="0" w:right="0" w:firstLine="709"/>
         <w:rPr>
           <w:bCs/>
@@ -1997,24 +2066,16 @@
           <w:sz w:val="28"/>
           <w:szCs w:val="28"/>
         </w:rPr>
-        <w:t>):</w:t>
-      </w:r>
-    </w:p>
-    <w:p>
-      <w:pPr>
-        <w:pStyle w:val="a3"/>
-        <w:numPr>
-          <w:ilvl w:val="1"/>
-          <w:numId w:val="30"/>
-        </w:numPr>
-        <w:spacing w:after="0" w:line="324" w:lineRule="auto"/>
-        <w:ind w:left="0" w:right="0" w:firstLine="1418"/>
-        <w:rPr>
-          <w:bCs/>
-          <w:sz w:val="28"/>
-          <w:szCs w:val="28"/>
-        </w:rPr>
-      </w:pPr>
+        <w:t>)</w:t>
+      </w:r>
+      <w:r>
+        <w:rPr>
+          <w:bCs/>
+          <w:sz w:val="28"/>
+          <w:szCs w:val="28"/>
+        </w:rPr>
+        <w:t xml:space="preserve">. </w:t>
+      </w:r>
       <w:r>
         <w:rPr>
           <w:bCs/>
@@ -2023,22 +2084,14 @@
         </w:rPr>
         <w:t>Преимущества: высокая адаптивность к изменениям, быстрые циклы разработки, возможность раннего выявления ошибок.</w:t>
       </w:r>
-    </w:p>
-    <w:p>
-      <w:pPr>
-        <w:pStyle w:val="a3"/>
-        <w:numPr>
-          <w:ilvl w:val="1"/>
-          <w:numId w:val="30"/>
-        </w:numPr>
-        <w:spacing w:after="0" w:line="324" w:lineRule="auto"/>
-        <w:ind w:left="0" w:right="0" w:firstLine="1418"/>
-        <w:rPr>
-          <w:bCs/>
-          <w:sz w:val="28"/>
-          <w:szCs w:val="28"/>
-        </w:rPr>
-      </w:pPr>
+      <w:r>
+        <w:rPr>
+          <w:bCs/>
+          <w:sz w:val="28"/>
+          <w:szCs w:val="28"/>
+        </w:rPr>
+        <w:t xml:space="preserve"> </w:t>
+      </w:r>
       <w:r>
         <w:rPr>
           <w:bCs/>
@@ -2055,7 +2108,7 @@
           <w:ilvl w:val="0"/>
           <w:numId w:val="30"/>
         </w:numPr>
-        <w:spacing w:after="0" w:line="324" w:lineRule="auto"/>
+        <w:spacing w:after="0" w:line="312" w:lineRule="auto"/>
         <w:ind w:left="0" w:right="0" w:firstLine="709"/>
         <w:rPr>
           <w:bCs/>
@@ -2069,24 +2122,16 @@
           <w:sz w:val="28"/>
           <w:szCs w:val="28"/>
         </w:rPr>
-        <w:t>Объектно-ориентированное проектирование (ООП):</w:t>
-      </w:r>
-    </w:p>
-    <w:p>
-      <w:pPr>
-        <w:pStyle w:val="a3"/>
-        <w:numPr>
-          <w:ilvl w:val="1"/>
-          <w:numId w:val="30"/>
-        </w:numPr>
-        <w:spacing w:after="0" w:line="324" w:lineRule="auto"/>
-        <w:ind w:left="0" w:right="0" w:firstLine="1418"/>
-        <w:rPr>
-          <w:bCs/>
-          <w:sz w:val="28"/>
-          <w:szCs w:val="28"/>
-        </w:rPr>
-      </w:pPr>
+        <w:t>Объектно-ориентированное проектирование (ООП)</w:t>
+      </w:r>
+      <w:r>
+        <w:rPr>
+          <w:bCs/>
+          <w:sz w:val="28"/>
+          <w:szCs w:val="28"/>
+        </w:rPr>
+        <w:t xml:space="preserve">. </w:t>
+      </w:r>
       <w:r>
         <w:rPr>
           <w:bCs/>
@@ -2095,22 +2140,14 @@
         </w:rPr>
         <w:t>Преимущества: модульность, удобство в поддержке и расширении системы.</w:t>
       </w:r>
-    </w:p>
-    <w:p>
-      <w:pPr>
-        <w:pStyle w:val="a3"/>
-        <w:numPr>
-          <w:ilvl w:val="1"/>
-          <w:numId w:val="30"/>
-        </w:numPr>
-        <w:spacing w:after="0" w:line="324" w:lineRule="auto"/>
-        <w:ind w:left="0" w:right="0" w:firstLine="1418"/>
-        <w:rPr>
-          <w:bCs/>
-          <w:sz w:val="28"/>
-          <w:szCs w:val="28"/>
-        </w:rPr>
-      </w:pPr>
+      <w:r>
+        <w:rPr>
+          <w:bCs/>
+          <w:sz w:val="28"/>
+          <w:szCs w:val="28"/>
+        </w:rPr>
+        <w:t xml:space="preserve"> </w:t>
+      </w:r>
       <w:r>
         <w:rPr>
           <w:bCs/>
@@ -2122,8 +2159,9 @@
     </w:p>
     <w:p>
       <w:pPr>
-        <w:spacing w:after="0" w:line="324" w:lineRule="auto"/>
+        <w:spacing w:after="0" w:line="312" w:lineRule="auto"/>
         <w:ind w:left="709" w:right="0" w:firstLine="0"/>
+        <w:contextualSpacing/>
         <w:rPr>
           <w:bCs/>
           <w:i/>
@@ -2140,27 +2178,94 @@
           <w:sz w:val="28"/>
           <w:szCs w:val="28"/>
         </w:rPr>
+        <w:t>5.3 Совмещение методов и использование гибридных подходов</w:t>
+      </w:r>
+    </w:p>
+    <w:p>
+      <w:pPr>
+        <w:spacing w:after="0" w:line="312" w:lineRule="auto"/>
+        <w:ind w:left="0" w:right="0" w:firstLine="709"/>
+        <w:contextualSpacing/>
+        <w:rPr>
+          <w:bCs/>
+          <w:sz w:val="28"/>
+          <w:szCs w:val="28"/>
+        </w:rPr>
+      </w:pPr>
+      <w:r>
+        <w:rPr>
+          <w:bCs/>
+          <w:sz w:val="28"/>
+          <w:szCs w:val="28"/>
+        </w:rPr>
+        <w:t xml:space="preserve">В практике часто используется комбинация различных методов, например, сочетание гибкой методологии с элементами водопадной модели. Такой подход позволяет использовать преимущества обеих методологий: </w:t>
+      </w:r>
+      <w:r>
+        <w:rPr>
+          <w:bCs/>
+          <w:sz w:val="28"/>
+          <w:szCs w:val="28"/>
+        </w:rPr>
         <w:lastRenderedPageBreak/>
-        <w:t>5.3 Совмещение методов и использование гибридных подходов</w:t>
-      </w:r>
-    </w:p>
-    <w:p>
-      <w:pPr>
-        <w:spacing w:after="0" w:line="324" w:lineRule="auto"/>
+        <w:t xml:space="preserve">гибкость </w:t>
+      </w:r>
+      <w:proofErr w:type="spellStart"/>
+      <w:r>
+        <w:rPr>
+          <w:bCs/>
+          <w:sz w:val="28"/>
+          <w:szCs w:val="28"/>
+        </w:rPr>
+        <w:t>Agile</w:t>
+      </w:r>
+      <w:proofErr w:type="spellEnd"/>
+      <w:r>
+        <w:rPr>
+          <w:bCs/>
+          <w:sz w:val="28"/>
+          <w:szCs w:val="28"/>
+        </w:rPr>
+        <w:t xml:space="preserve"> для изменений и быстрое реагирование, а также структурированность водопадной модели для контроля и документации.</w:t>
+      </w:r>
+    </w:p>
+    <w:p>
+      <w:pPr>
+        <w:spacing w:after="0" w:line="312" w:lineRule="auto"/>
         <w:ind w:left="0" w:right="0" w:firstLine="709"/>
-        <w:rPr>
-          <w:bCs/>
-          <w:sz w:val="28"/>
-          <w:szCs w:val="28"/>
-        </w:rPr>
-      </w:pPr>
-      <w:r>
-        <w:rPr>
-          <w:bCs/>
-          <w:sz w:val="28"/>
-          <w:szCs w:val="28"/>
-        </w:rPr>
-        <w:t xml:space="preserve">В практике часто используется комбинация различных методов, например, сочетание гибкой методологии с элементами водопадной модели. Такой подход позволяет использовать преимущества обеих методологий: гибкость </w:t>
+        <w:contextualSpacing/>
+        <w:rPr>
+          <w:b/>
+          <w:sz w:val="28"/>
+          <w:szCs w:val="28"/>
+        </w:rPr>
+      </w:pPr>
+      <w:r>
+        <w:rPr>
+          <w:b/>
+          <w:sz w:val="28"/>
+          <w:szCs w:val="28"/>
+        </w:rPr>
+        <w:t>6 Обоснование выбора метода проектирования</w:t>
+      </w:r>
+    </w:p>
+    <w:p>
+      <w:pPr>
+        <w:spacing w:after="0" w:line="312" w:lineRule="auto"/>
+        <w:ind w:left="0" w:right="0" w:firstLine="709"/>
+        <w:contextualSpacing/>
+        <w:rPr>
+          <w:bCs/>
+          <w:sz w:val="28"/>
+          <w:szCs w:val="28"/>
+        </w:rPr>
+      </w:pPr>
+      <w:r>
+        <w:rPr>
+          <w:bCs/>
+          <w:sz w:val="28"/>
+          <w:szCs w:val="28"/>
+        </w:rPr>
+        <w:t xml:space="preserve">Для реализации проекта «Автоматизированная система оказания услуг по ремонту телевизоров» был выбран гибкий подход к проектированию, основанный на принципах </w:t>
       </w:r>
       <w:proofErr w:type="spellStart"/>
       <w:r>
@@ -2178,69 +2283,14 @@
           <w:sz w:val="28"/>
           <w:szCs w:val="28"/>
         </w:rPr>
-        <w:t xml:space="preserve"> для изменений и быстрое реагирование, а также структурированность водопадной модели для контроля и документации.</w:t>
-      </w:r>
-    </w:p>
-    <w:p>
-      <w:pPr>
-        <w:spacing w:after="0" w:line="324" w:lineRule="auto"/>
+        <w:t xml:space="preserve"> с элементами итерационной (спиральной) модели разработки, а также использованием объектно-ориентированного проектирования (ООП).</w:t>
+      </w:r>
+    </w:p>
+    <w:p>
+      <w:pPr>
+        <w:spacing w:after="0" w:line="312" w:lineRule="auto"/>
         <w:ind w:left="0" w:right="0" w:firstLine="709"/>
-        <w:rPr>
-          <w:b/>
-          <w:sz w:val="28"/>
-          <w:szCs w:val="28"/>
-        </w:rPr>
-      </w:pPr>
-      <w:r>
-        <w:rPr>
-          <w:b/>
-          <w:sz w:val="28"/>
-          <w:szCs w:val="28"/>
-        </w:rPr>
-        <w:t>6 Обоснование выбора метода проектирования</w:t>
-      </w:r>
-    </w:p>
-    <w:p>
-      <w:pPr>
-        <w:spacing w:after="0" w:line="324" w:lineRule="auto"/>
-        <w:ind w:left="0" w:right="0" w:firstLine="709"/>
-        <w:rPr>
-          <w:bCs/>
-          <w:sz w:val="28"/>
-          <w:szCs w:val="28"/>
-        </w:rPr>
-      </w:pPr>
-      <w:r>
-        <w:rPr>
-          <w:bCs/>
-          <w:sz w:val="28"/>
-          <w:szCs w:val="28"/>
-        </w:rPr>
-        <w:t xml:space="preserve">Для реализации проекта «Автоматизированная система оказания услуг по ремонту телевизоров» был выбран гибкий подход к проектированию, основанный на принципах </w:t>
-      </w:r>
-      <w:proofErr w:type="spellStart"/>
-      <w:r>
-        <w:rPr>
-          <w:bCs/>
-          <w:sz w:val="28"/>
-          <w:szCs w:val="28"/>
-        </w:rPr>
-        <w:t>Agile</w:t>
-      </w:r>
-      <w:proofErr w:type="spellEnd"/>
-      <w:r>
-        <w:rPr>
-          <w:bCs/>
-          <w:sz w:val="28"/>
-          <w:szCs w:val="28"/>
-        </w:rPr>
-        <w:t xml:space="preserve"> с элементами итерационной (спиральной) модели разработки, а также использованием объектно-ориентированного проектирования (ООП).</w:t>
-      </w:r>
-    </w:p>
-    <w:p>
-      <w:pPr>
-        <w:spacing w:after="0" w:line="324" w:lineRule="auto"/>
-        <w:ind w:left="0" w:right="0" w:firstLine="709"/>
+        <w:contextualSpacing/>
         <w:rPr>
           <w:bCs/>
           <w:sz w:val="28"/>
@@ -2263,7 +2313,7 @@
           <w:ilvl w:val="0"/>
           <w:numId w:val="31"/>
         </w:numPr>
-        <w:spacing w:after="0" w:line="324" w:lineRule="auto"/>
+        <w:spacing w:after="0" w:line="312" w:lineRule="auto"/>
         <w:ind w:left="0" w:right="0" w:firstLine="709"/>
         <w:rPr>
           <w:bCs/>
@@ -2287,7 +2337,7 @@
           <w:ilvl w:val="0"/>
           <w:numId w:val="31"/>
         </w:numPr>
-        <w:spacing w:after="0" w:line="324" w:lineRule="auto"/>
+        <w:spacing w:after="0" w:line="312" w:lineRule="auto"/>
         <w:ind w:left="0" w:right="0" w:firstLine="709"/>
         <w:rPr>
           <w:bCs/>
@@ -2311,7 +2361,7 @@
           <w:ilvl w:val="0"/>
           <w:numId w:val="31"/>
         </w:numPr>
-        <w:spacing w:after="0" w:line="324" w:lineRule="auto"/>
+        <w:spacing w:after="0" w:line="312" w:lineRule="auto"/>
         <w:ind w:left="0" w:right="0" w:firstLine="709"/>
         <w:rPr>
           <w:bCs/>
@@ -2335,7 +2385,7 @@
           <w:ilvl w:val="0"/>
           <w:numId w:val="31"/>
         </w:numPr>
-        <w:spacing w:after="0" w:line="324" w:lineRule="auto"/>
+        <w:spacing w:after="0" w:line="312" w:lineRule="auto"/>
         <w:ind w:left="0" w:right="0" w:firstLine="709"/>
         <w:rPr>
           <w:bCs/>
@@ -2355,7 +2405,7 @@
     <w:p>
       <w:pPr>
         <w:pStyle w:val="a3"/>
-        <w:spacing w:after="0" w:line="324" w:lineRule="auto"/>
+        <w:spacing w:after="0" w:line="312" w:lineRule="auto"/>
         <w:ind w:left="0" w:right="0" w:firstLine="709"/>
         <w:rPr>
           <w:bCs/>
@@ -2374,8 +2424,9 @@
     </w:p>
     <w:p>
       <w:pPr>
-        <w:spacing w:after="0" w:line="324" w:lineRule="auto"/>
+        <w:spacing w:after="0" w:line="312" w:lineRule="auto"/>
         <w:ind w:left="0" w:right="0" w:firstLine="709"/>
+        <w:contextualSpacing/>
         <w:rPr>
           <w:b/>
           <w:sz w:val="28"/>
@@ -2388,7 +2439,6 @@
           <w:sz w:val="28"/>
           <w:szCs w:val="28"/>
         </w:rPr>
-        <w:lastRenderedPageBreak/>
         <w:t xml:space="preserve">ЗАКАЗЧИК </w:t>
       </w:r>
       <w:r>
@@ -2417,8 +2467,9 @@
     </w:p>
     <w:p>
       <w:pPr>
-        <w:spacing w:after="0" w:line="324" w:lineRule="auto"/>
+        <w:spacing w:after="0" w:line="312" w:lineRule="auto"/>
         <w:ind w:left="0" w:right="0" w:firstLine="709"/>
+        <w:contextualSpacing/>
         <w:rPr>
           <w:sz w:val="28"/>
           <w:szCs w:val="28"/>
@@ -2474,7 +2525,23 @@
           <w:sz w:val="28"/>
           <w:szCs w:val="28"/>
         </w:rPr>
-        <w:t>“ ___ ” _________________202</w:t>
+        <w:t>“ __</w:t>
+      </w:r>
+      <w:proofErr w:type="gramStart"/>
+      <w:r>
+        <w:rPr>
+          <w:sz w:val="28"/>
+          <w:szCs w:val="28"/>
+        </w:rPr>
+        <w:t>_ ”</w:t>
+      </w:r>
+      <w:proofErr w:type="gramEnd"/>
+      <w:r>
+        <w:rPr>
+          <w:sz w:val="28"/>
+          <w:szCs w:val="28"/>
+        </w:rPr>
+        <w:t xml:space="preserve"> _________________202</w:t>
       </w:r>
       <w:r>
         <w:rPr>
@@ -2493,8 +2560,9 @@
     </w:p>
     <w:p>
       <w:pPr>
-        <w:spacing w:after="0" w:line="324" w:lineRule="auto"/>
+        <w:spacing w:after="0" w:line="312" w:lineRule="auto"/>
         <w:ind w:left="0" w:right="0" w:firstLine="709"/>
+        <w:contextualSpacing/>
         <w:jc w:val="left"/>
         <w:rPr>
           <w:sz w:val="28"/>
@@ -2517,7 +2585,7 @@
 </file>
 
 <file path=word/endnotes.xml><?xml version="1.0" encoding="utf-8"?>
-<w:endnotes xmlns:wpc="http://schemas.microsoft.com/office/word/2010/wordprocessingCanvas" xmlns:cx="http://schemas.microsoft.com/office/drawing/2014/chartex" xmlns:cx1="http://schemas.microsoft.com/office/drawing/2015/9/8/chartex" xmlns:cx2="http://schemas.microsoft.com/office/drawing/2015/10/21/chartex" xmlns:cx3="http://schemas.microsoft.com/office/drawing/2016/5/9/chartex" xmlns:cx4="http://schemas.microsoft.com/office/drawing/2016/5/10/chartex" xmlns:cx5="http://schemas.microsoft.com/office/drawing/2016/5/11/chartex" xmlns:cx6="http://schemas.microsoft.com/office/drawing/2016/5/12/chartex" xmlns:cx7="http://schemas.microsoft.com/office/drawing/2016/5/13/chartex" xmlns:cx8="http://schemas.microsoft.com/office/drawing/2016/5/14/chartex" xmlns:mc="http://schemas.openxmlformats.org/markup-compatibility/2006" xmlns:aink="http://schemas.microsoft.com/office/drawing/2016/ink" xmlns:am3d="http://schemas.microsoft.com/office/drawing/2017/model3d" xmlns:o="urn:schemas-microsoft-com:office:office" xmlns:r="http://schemas.openxmlformats.org/officeDocument/2006/relationships" xmlns:m="http://schemas.openxmlformats.org/officeDocument/2006/math" xmlns:v="urn:schemas-microsoft-com:vml" xmlns:wp14="http://schemas.microsoft.com/office/word/2010/wordprocessingDrawing" xmlns:wp="http://schemas.openxmlformats.org/drawingml/2006/wordprocessingDrawing" xmlns:w10="urn:schemas-microsoft-com:office:word" xmlns:w="http://schemas.openxmlformats.org/wordprocessingml/2006/main" xmlns:w14="http://schemas.microsoft.com/office/word/2010/wordml" xmlns:w15="http://schemas.microsoft.com/office/word/2012/wordml" xmlns:w16cex="http://schemas.microsoft.com/office/word/2018/wordml/cex" xmlns:w16cid="http://schemas.microsoft.com/office/word/2016/wordml/cid" xmlns:w16="http://schemas.microsoft.com/office/word/2018/wordml" xmlns:w16sdtdh="http://schemas.microsoft.com/office/word/2020/wordml/sdtdatahash" xmlns:w16se="http://schemas.microsoft.com/office/word/2015/wordml/symex" xmlns:wpg="http://schemas.microsoft.com/office/word/2010/wordprocessingGroup" xmlns:wpi="http://schemas.microsoft.com/office/word/2010/wordprocessingInk" xmlns:wne="http://schemas.microsoft.com/office/word/2006/wordml" xmlns:wps="http://schemas.microsoft.com/office/word/2010/wordprocessingShape" mc:Ignorable="w14 w15 w16se w16cid w16 w16cex w16sdtdh wp14">
+<w:endnotes xmlns:wpc="http://schemas.microsoft.com/office/word/2010/wordprocessingCanvas" xmlns:cx="http://schemas.microsoft.com/office/drawing/2014/chartex" xmlns:cx1="http://schemas.microsoft.com/office/drawing/2015/9/8/chartex" xmlns:cx2="http://schemas.microsoft.com/office/drawing/2015/10/21/chartex" xmlns:cx3="http://schemas.microsoft.com/office/drawing/2016/5/9/chartex" xmlns:cx4="http://schemas.microsoft.com/office/drawing/2016/5/10/chartex" xmlns:cx5="http://schemas.microsoft.com/office/drawing/2016/5/11/chartex" xmlns:cx6="http://schemas.microsoft.com/office/drawing/2016/5/12/chartex" xmlns:cx7="http://schemas.microsoft.com/office/drawing/2016/5/13/chartex" xmlns:cx8="http://schemas.microsoft.com/office/drawing/2016/5/14/chartex" xmlns:mc="http://schemas.openxmlformats.org/markup-compatibility/2006" xmlns:aink="http://schemas.microsoft.com/office/drawing/2016/ink" xmlns:am3d="http://schemas.microsoft.com/office/drawing/2017/model3d" xmlns:o="urn:schemas-microsoft-com:office:office" xmlns:oel="http://schemas.microsoft.com/office/2019/extlst" xmlns:r="http://schemas.openxmlformats.org/officeDocument/2006/relationships" xmlns:m="http://schemas.openxmlformats.org/officeDocument/2006/math" xmlns:v="urn:schemas-microsoft-com:vml" xmlns:wp14="http://schemas.microsoft.com/office/word/2010/wordprocessingDrawing" xmlns:wp="http://schemas.openxmlformats.org/drawingml/2006/wordprocessingDrawing" xmlns:w10="urn:schemas-microsoft-com:office:word" xmlns:w="http://schemas.openxmlformats.org/wordprocessingml/2006/main" xmlns:w14="http://schemas.microsoft.com/office/word/2010/wordml" xmlns:w15="http://schemas.microsoft.com/office/word/2012/wordml" xmlns:w16cex="http://schemas.microsoft.com/office/word/2018/wordml/cex" xmlns:w16cid="http://schemas.microsoft.com/office/word/2016/wordml/cid" xmlns:w16="http://schemas.microsoft.com/office/word/2018/wordml" xmlns:w16sdtdh="http://schemas.microsoft.com/office/word/2020/wordml/sdtdatahash" xmlns:w16se="http://schemas.microsoft.com/office/word/2015/wordml/symex" xmlns:wpg="http://schemas.microsoft.com/office/word/2010/wordprocessingGroup" xmlns:wpi="http://schemas.microsoft.com/office/word/2010/wordprocessingInk" xmlns:wne="http://schemas.microsoft.com/office/word/2006/wordml" xmlns:wps="http://schemas.microsoft.com/office/word/2010/wordprocessingShape" mc:Ignorable="w14 w15 w16se w16cid w16 w16cex w16sdtdh wp14">
   <w:endnote w:type="separator" w:id="-1">
     <w:p>
       <w:pPr>
@@ -2542,7 +2610,7 @@
 </file>
 
 <file path=word/footer1.xml><?xml version="1.0" encoding="utf-8"?>
-<w:ftr xmlns:wpc="http://schemas.microsoft.com/office/word/2010/wordprocessingCanvas" xmlns:cx="http://schemas.microsoft.com/office/drawing/2014/chartex" xmlns:cx1="http://schemas.microsoft.com/office/drawing/2015/9/8/chartex" xmlns:cx2="http://schemas.microsoft.com/office/drawing/2015/10/21/chartex" xmlns:cx3="http://schemas.microsoft.com/office/drawing/2016/5/9/chartex" xmlns:cx4="http://schemas.microsoft.com/office/drawing/2016/5/10/chartex" xmlns:cx5="http://schemas.microsoft.com/office/drawing/2016/5/11/chartex" xmlns:cx6="http://schemas.microsoft.com/office/drawing/2016/5/12/chartex" xmlns:cx7="http://schemas.microsoft.com/office/drawing/2016/5/13/chartex" xmlns:cx8="http://schemas.microsoft.com/office/drawing/2016/5/14/chartex" xmlns:mc="http://schemas.openxmlformats.org/markup-compatibility/2006" xmlns:aink="http://schemas.microsoft.com/office/drawing/2016/ink" xmlns:am3d="http://schemas.microsoft.com/office/drawing/2017/model3d" xmlns:o="urn:schemas-microsoft-com:office:office" xmlns:r="http://schemas.openxmlformats.org/officeDocument/2006/relationships" xmlns:m="http://schemas.openxmlformats.org/officeDocument/2006/math" xmlns:v="urn:schemas-microsoft-com:vml" xmlns:wp14="http://schemas.microsoft.com/office/word/2010/wordprocessingDrawing" xmlns:wp="http://schemas.openxmlformats.org/drawingml/2006/wordprocessingDrawing" xmlns:w10="urn:schemas-microsoft-com:office:word" xmlns:w="http://schemas.openxmlformats.org/wordprocessingml/2006/main" xmlns:w14="http://schemas.microsoft.com/office/word/2010/wordml" xmlns:w15="http://schemas.microsoft.com/office/word/2012/wordml" xmlns:w16cex="http://schemas.microsoft.com/office/word/2018/wordml/cex" xmlns:w16cid="http://schemas.microsoft.com/office/word/2016/wordml/cid" xmlns:w16="http://schemas.microsoft.com/office/word/2018/wordml" xmlns:w16sdtdh="http://schemas.microsoft.com/office/word/2020/wordml/sdtdatahash" xmlns:w16se="http://schemas.microsoft.com/office/word/2015/wordml/symex" xmlns:wpg="http://schemas.microsoft.com/office/word/2010/wordprocessingGroup" xmlns:wpi="http://schemas.microsoft.com/office/word/2010/wordprocessingInk" xmlns:wne="http://schemas.microsoft.com/office/word/2006/wordml" xmlns:wps="http://schemas.microsoft.com/office/word/2010/wordprocessingShape" mc:Ignorable="w14 w15 w16se w16cid w16 w16cex w16sdtdh wp14">
+<w:ftr xmlns:wpc="http://schemas.microsoft.com/office/word/2010/wordprocessingCanvas" xmlns:cx="http://schemas.microsoft.com/office/drawing/2014/chartex" xmlns:cx1="http://schemas.microsoft.com/office/drawing/2015/9/8/chartex" xmlns:cx2="http://schemas.microsoft.com/office/drawing/2015/10/21/chartex" xmlns:cx3="http://schemas.microsoft.com/office/drawing/2016/5/9/chartex" xmlns:cx4="http://schemas.microsoft.com/office/drawing/2016/5/10/chartex" xmlns:cx5="http://schemas.microsoft.com/office/drawing/2016/5/11/chartex" xmlns:cx6="http://schemas.microsoft.com/office/drawing/2016/5/12/chartex" xmlns:cx7="http://schemas.microsoft.com/office/drawing/2016/5/13/chartex" xmlns:cx8="http://schemas.microsoft.com/office/drawing/2016/5/14/chartex" xmlns:mc="http://schemas.openxmlformats.org/markup-compatibility/2006" xmlns:aink="http://schemas.microsoft.com/office/drawing/2016/ink" xmlns:am3d="http://schemas.microsoft.com/office/drawing/2017/model3d" xmlns:o="urn:schemas-microsoft-com:office:office" xmlns:oel="http://schemas.microsoft.com/office/2019/extlst" xmlns:r="http://schemas.openxmlformats.org/officeDocument/2006/relationships" xmlns:m="http://schemas.openxmlformats.org/officeDocument/2006/math" xmlns:v="urn:schemas-microsoft-com:vml" xmlns:wp14="http://schemas.microsoft.com/office/word/2010/wordprocessingDrawing" xmlns:wp="http://schemas.openxmlformats.org/drawingml/2006/wordprocessingDrawing" xmlns:w10="urn:schemas-microsoft-com:office:word" xmlns:w="http://schemas.openxmlformats.org/wordprocessingml/2006/main" xmlns:w14="http://schemas.microsoft.com/office/word/2010/wordml" xmlns:w15="http://schemas.microsoft.com/office/word/2012/wordml" xmlns:w16cex="http://schemas.microsoft.com/office/word/2018/wordml/cex" xmlns:w16cid="http://schemas.microsoft.com/office/word/2016/wordml/cid" xmlns:w16="http://schemas.microsoft.com/office/word/2018/wordml" xmlns:w16sdtdh="http://schemas.microsoft.com/office/word/2020/wordml/sdtdatahash" xmlns:w16se="http://schemas.microsoft.com/office/word/2015/wordml/symex" xmlns:wpg="http://schemas.microsoft.com/office/word/2010/wordprocessingGroup" xmlns:wpi="http://schemas.microsoft.com/office/word/2010/wordprocessingInk" xmlns:wne="http://schemas.microsoft.com/office/word/2006/wordml" xmlns:wps="http://schemas.microsoft.com/office/word/2010/wordprocessingShape" mc:Ignorable="w14 w15 w16se w16cid w16 w16cex w16sdtdh wp14">
   <w:sdt>
     <w:sdtPr>
       <w:id w:val="988131432"/>
@@ -2551,7 +2619,6 @@
         <w:docPartUnique/>
       </w:docPartObj>
     </w:sdtPr>
-    <w:sdtEndPr/>
     <w:sdtContent>
       <w:p>
         <w:pPr>
@@ -2589,7 +2656,7 @@
 </file>
 
 <file path=word/footer2.xml><?xml version="1.0" encoding="utf-8"?>
-<w:ftr xmlns:wpc="http://schemas.microsoft.com/office/word/2010/wordprocessingCanvas" xmlns:cx="http://schemas.microsoft.com/office/drawing/2014/chartex" xmlns:cx1="http://schemas.microsoft.com/office/drawing/2015/9/8/chartex" xmlns:cx2="http://schemas.microsoft.com/office/drawing/2015/10/21/chartex" xmlns:cx3="http://schemas.microsoft.com/office/drawing/2016/5/9/chartex" xmlns:cx4="http://schemas.microsoft.com/office/drawing/2016/5/10/chartex" xmlns:cx5="http://schemas.microsoft.com/office/drawing/2016/5/11/chartex" xmlns:cx6="http://schemas.microsoft.com/office/drawing/2016/5/12/chartex" xmlns:cx7="http://schemas.microsoft.com/office/drawing/2016/5/13/chartex" xmlns:cx8="http://schemas.microsoft.com/office/drawing/2016/5/14/chartex" xmlns:mc="http://schemas.openxmlformats.org/markup-compatibility/2006" xmlns:aink="http://schemas.microsoft.com/office/drawing/2016/ink" xmlns:am3d="http://schemas.microsoft.com/office/drawing/2017/model3d" xmlns:o="urn:schemas-microsoft-com:office:office" xmlns:r="http://schemas.openxmlformats.org/officeDocument/2006/relationships" xmlns:m="http://schemas.openxmlformats.org/officeDocument/2006/math" xmlns:v="urn:schemas-microsoft-com:vml" xmlns:wp14="http://schemas.microsoft.com/office/word/2010/wordprocessingDrawing" xmlns:wp="http://schemas.openxmlformats.org/drawingml/2006/wordprocessingDrawing" xmlns:w10="urn:schemas-microsoft-com:office:word" xmlns:w="http://schemas.openxmlformats.org/wordprocessingml/2006/main" xmlns:w14="http://schemas.microsoft.com/office/word/2010/wordml" xmlns:w15="http://schemas.microsoft.com/office/word/2012/wordml" xmlns:w16cex="http://schemas.microsoft.com/office/word/2018/wordml/cex" xmlns:w16cid="http://schemas.microsoft.com/office/word/2016/wordml/cid" xmlns:w16="http://schemas.microsoft.com/office/word/2018/wordml" xmlns:w16sdtdh="http://schemas.microsoft.com/office/word/2020/wordml/sdtdatahash" xmlns:w16se="http://schemas.microsoft.com/office/word/2015/wordml/symex" xmlns:wpg="http://schemas.microsoft.com/office/word/2010/wordprocessingGroup" xmlns:wpi="http://schemas.microsoft.com/office/word/2010/wordprocessingInk" xmlns:wne="http://schemas.microsoft.com/office/word/2006/wordml" xmlns:wps="http://schemas.microsoft.com/office/word/2010/wordprocessingShape" mc:Ignorable="w14 w15 w16se w16cid w16 w16cex w16sdtdh wp14">
+<w:ftr xmlns:wpc="http://schemas.microsoft.com/office/word/2010/wordprocessingCanvas" xmlns:cx="http://schemas.microsoft.com/office/drawing/2014/chartex" xmlns:cx1="http://schemas.microsoft.com/office/drawing/2015/9/8/chartex" xmlns:cx2="http://schemas.microsoft.com/office/drawing/2015/10/21/chartex" xmlns:cx3="http://schemas.microsoft.com/office/drawing/2016/5/9/chartex" xmlns:cx4="http://schemas.microsoft.com/office/drawing/2016/5/10/chartex" xmlns:cx5="http://schemas.microsoft.com/office/drawing/2016/5/11/chartex" xmlns:cx6="http://schemas.microsoft.com/office/drawing/2016/5/12/chartex" xmlns:cx7="http://schemas.microsoft.com/office/drawing/2016/5/13/chartex" xmlns:cx8="http://schemas.microsoft.com/office/drawing/2016/5/14/chartex" xmlns:mc="http://schemas.openxmlformats.org/markup-compatibility/2006" xmlns:aink="http://schemas.microsoft.com/office/drawing/2016/ink" xmlns:am3d="http://schemas.microsoft.com/office/drawing/2017/model3d" xmlns:o="urn:schemas-microsoft-com:office:office" xmlns:oel="http://schemas.microsoft.com/office/2019/extlst" xmlns:r="http://schemas.openxmlformats.org/officeDocument/2006/relationships" xmlns:m="http://schemas.openxmlformats.org/officeDocument/2006/math" xmlns:v="urn:schemas-microsoft-com:vml" xmlns:wp14="http://schemas.microsoft.com/office/word/2010/wordprocessingDrawing" xmlns:wp="http://schemas.openxmlformats.org/drawingml/2006/wordprocessingDrawing" xmlns:w10="urn:schemas-microsoft-com:office:word" xmlns:w="http://schemas.openxmlformats.org/wordprocessingml/2006/main" xmlns:w14="http://schemas.microsoft.com/office/word/2010/wordml" xmlns:w15="http://schemas.microsoft.com/office/word/2012/wordml" xmlns:w16cex="http://schemas.microsoft.com/office/word/2018/wordml/cex" xmlns:w16cid="http://schemas.microsoft.com/office/word/2016/wordml/cid" xmlns:w16="http://schemas.microsoft.com/office/word/2018/wordml" xmlns:w16sdtdh="http://schemas.microsoft.com/office/word/2020/wordml/sdtdatahash" xmlns:w16se="http://schemas.microsoft.com/office/word/2015/wordml/symex" xmlns:wpg="http://schemas.microsoft.com/office/word/2010/wordprocessingGroup" xmlns:wpi="http://schemas.microsoft.com/office/word/2010/wordprocessingInk" xmlns:wne="http://schemas.microsoft.com/office/word/2006/wordml" xmlns:wps="http://schemas.microsoft.com/office/word/2010/wordprocessingShape" mc:Ignorable="w14 w15 w16se w16cid w16 w16cex w16sdtdh wp14">
   <w:p>
     <w:pPr>
       <w:pStyle w:val="aa"/>
@@ -2606,7 +2673,7 @@
 </file>
 
 <file path=word/footnotes.xml><?xml version="1.0" encoding="utf-8"?>
-<w:footnotes xmlns:wpc="http://schemas.microsoft.com/office/word/2010/wordprocessingCanvas" xmlns:cx="http://schemas.microsoft.com/office/drawing/2014/chartex" xmlns:cx1="http://schemas.microsoft.com/office/drawing/2015/9/8/chartex" xmlns:cx2="http://schemas.microsoft.com/office/drawing/2015/10/21/chartex" xmlns:cx3="http://schemas.microsoft.com/office/drawing/2016/5/9/chartex" xmlns:cx4="http://schemas.microsoft.com/office/drawing/2016/5/10/chartex" xmlns:cx5="http://schemas.microsoft.com/office/drawing/2016/5/11/chartex" xmlns:cx6="http://schemas.microsoft.com/office/drawing/2016/5/12/chartex" xmlns:cx7="http://schemas.microsoft.com/office/drawing/2016/5/13/chartex" xmlns:cx8="http://schemas.microsoft.com/office/drawing/2016/5/14/chartex" xmlns:mc="http://schemas.openxmlformats.org/markup-compatibility/2006" xmlns:aink="http://schemas.microsoft.com/office/drawing/2016/ink" xmlns:am3d="http://schemas.microsoft.com/office/drawing/2017/model3d" xmlns:o="urn:schemas-microsoft-com:office:office" xmlns:r="http://schemas.openxmlformats.org/officeDocument/2006/relationships" xmlns:m="http://schemas.openxmlformats.org/officeDocument/2006/math" xmlns:v="urn:schemas-microsoft-com:vml" xmlns:wp14="http://schemas.microsoft.com/office/word/2010/wordprocessingDrawing" xmlns:wp="http://schemas.openxmlformats.org/drawingml/2006/wordprocessingDrawing" xmlns:w10="urn:schemas-microsoft-com:office:word" xmlns:w="http://schemas.openxmlformats.org/wordprocessingml/2006/main" xmlns:w14="http://schemas.microsoft.com/office/word/2010/wordml" xmlns:w15="http://schemas.microsoft.com/office/word/2012/wordml" xmlns:w16cex="http://schemas.microsoft.com/office/word/2018/wordml/cex" xmlns:w16cid="http://schemas.microsoft.com/office/word/2016/wordml/cid" xmlns:w16="http://schemas.microsoft.com/office/word/2018/wordml" xmlns:w16sdtdh="http://schemas.microsoft.com/office/word/2020/wordml/sdtdatahash" xmlns:w16se="http://schemas.microsoft.com/office/word/2015/wordml/symex" xmlns:wpg="http://schemas.microsoft.com/office/word/2010/wordprocessingGroup" xmlns:wpi="http://schemas.microsoft.com/office/word/2010/wordprocessingInk" xmlns:wne="http://schemas.microsoft.com/office/word/2006/wordml" xmlns:wps="http://schemas.microsoft.com/office/word/2010/wordprocessingShape" mc:Ignorable="w14 w15 w16se w16cid w16 w16cex w16sdtdh wp14">
+<w:footnotes xmlns:wpc="http://schemas.microsoft.com/office/word/2010/wordprocessingCanvas" xmlns:cx="http://schemas.microsoft.com/office/drawing/2014/chartex" xmlns:cx1="http://schemas.microsoft.com/office/drawing/2015/9/8/chartex" xmlns:cx2="http://schemas.microsoft.com/office/drawing/2015/10/21/chartex" xmlns:cx3="http://schemas.microsoft.com/office/drawing/2016/5/9/chartex" xmlns:cx4="http://schemas.microsoft.com/office/drawing/2016/5/10/chartex" xmlns:cx5="http://schemas.microsoft.com/office/drawing/2016/5/11/chartex" xmlns:cx6="http://schemas.microsoft.com/office/drawing/2016/5/12/chartex" xmlns:cx7="http://schemas.microsoft.com/office/drawing/2016/5/13/chartex" xmlns:cx8="http://schemas.microsoft.com/office/drawing/2016/5/14/chartex" xmlns:mc="http://schemas.openxmlformats.org/markup-compatibility/2006" xmlns:aink="http://schemas.microsoft.com/office/drawing/2016/ink" xmlns:am3d="http://schemas.microsoft.com/office/drawing/2017/model3d" xmlns:o="urn:schemas-microsoft-com:office:office" xmlns:oel="http://schemas.microsoft.com/office/2019/extlst" xmlns:r="http://schemas.openxmlformats.org/officeDocument/2006/relationships" xmlns:m="http://schemas.openxmlformats.org/officeDocument/2006/math" xmlns:v="urn:schemas-microsoft-com:vml" xmlns:wp14="http://schemas.microsoft.com/office/word/2010/wordprocessingDrawing" xmlns:wp="http://schemas.openxmlformats.org/drawingml/2006/wordprocessingDrawing" xmlns:w10="urn:schemas-microsoft-com:office:word" xmlns:w="http://schemas.openxmlformats.org/wordprocessingml/2006/main" xmlns:w14="http://schemas.microsoft.com/office/word/2010/wordml" xmlns:w15="http://schemas.microsoft.com/office/word/2012/wordml" xmlns:w16cex="http://schemas.microsoft.com/office/word/2018/wordml/cex" xmlns:w16cid="http://schemas.microsoft.com/office/word/2016/wordml/cid" xmlns:w16="http://schemas.microsoft.com/office/word/2018/wordml" xmlns:w16sdtdh="http://schemas.microsoft.com/office/word/2020/wordml/sdtdatahash" xmlns:w16se="http://schemas.microsoft.com/office/word/2015/wordml/symex" xmlns:wpg="http://schemas.microsoft.com/office/word/2010/wordprocessingGroup" xmlns:wpi="http://schemas.microsoft.com/office/word/2010/wordprocessingInk" xmlns:wne="http://schemas.microsoft.com/office/word/2006/wordml" xmlns:wps="http://schemas.microsoft.com/office/word/2010/wordprocessingShape" mc:Ignorable="w14 w15 w16se w16cid w16 w16cex w16sdtdh wp14">
   <w:footnote w:type="separator" w:id="-1">
     <w:p>
       <w:pPr>
@@ -2631,7 +2698,7 @@
 </file>
 
 <file path=word/numbering.xml><?xml version="1.0" encoding="utf-8"?>
-<w:numbering xmlns:wpc="http://schemas.microsoft.com/office/word/2010/wordprocessingCanvas" xmlns:cx="http://schemas.microsoft.com/office/drawing/2014/chartex" xmlns:cx1="http://schemas.microsoft.com/office/drawing/2015/9/8/chartex" xmlns:cx2="http://schemas.microsoft.com/office/drawing/2015/10/21/chartex" xmlns:cx3="http://schemas.microsoft.com/office/drawing/2016/5/9/chartex" xmlns:cx4="http://schemas.microsoft.com/office/drawing/2016/5/10/chartex" xmlns:cx5="http://schemas.microsoft.com/office/drawing/2016/5/11/chartex" xmlns:cx6="http://schemas.microsoft.com/office/drawing/2016/5/12/chartex" xmlns:cx7="http://schemas.microsoft.com/office/drawing/2016/5/13/chartex" xmlns:cx8="http://schemas.microsoft.com/office/drawing/2016/5/14/chartex" xmlns:mc="http://schemas.openxmlformats.org/markup-compatibility/2006" xmlns:aink="http://schemas.microsoft.com/office/drawing/2016/ink" xmlns:am3d="http://schemas.microsoft.com/office/drawing/2017/model3d" xmlns:o="urn:schemas-microsoft-com:office:office" xmlns:r="http://schemas.openxmlformats.org/officeDocument/2006/relationships" xmlns:m="http://schemas.openxmlformats.org/officeDocument/2006/math" xmlns:v="urn:schemas-microsoft-com:vml" xmlns:wp14="http://schemas.microsoft.com/office/word/2010/wordprocessingDrawing" xmlns:wp="http://schemas.openxmlformats.org/drawingml/2006/wordprocessingDrawing" xmlns:w10="urn:schemas-microsoft-com:office:word" xmlns:w="http://schemas.openxmlformats.org/wordprocessingml/2006/main" xmlns:w14="http://schemas.microsoft.com/office/word/2010/wordml" xmlns:w15="http://schemas.microsoft.com/office/word/2012/wordml" xmlns:w16cex="http://schemas.microsoft.com/office/word/2018/wordml/cex" xmlns:w16cid="http://schemas.microsoft.com/office/word/2016/wordml/cid" xmlns:w16="http://schemas.microsoft.com/office/word/2018/wordml" xmlns:w16sdtdh="http://schemas.microsoft.com/office/word/2020/wordml/sdtdatahash" xmlns:w16se="http://schemas.microsoft.com/office/word/2015/wordml/symex" xmlns:wpg="http://schemas.microsoft.com/office/word/2010/wordprocessingGroup" xmlns:wpi="http://schemas.microsoft.com/office/word/2010/wordprocessingInk" xmlns:wne="http://schemas.microsoft.com/office/word/2006/wordml" xmlns:wps="http://schemas.microsoft.com/office/word/2010/wordprocessingShape" mc:Ignorable="w14 w15 w16se w16cid w16 w16cex w16sdtdh wp14">
+<w:numbering xmlns:wpc="http://schemas.microsoft.com/office/word/2010/wordprocessingCanvas" xmlns:cx="http://schemas.microsoft.com/office/drawing/2014/chartex" xmlns:cx1="http://schemas.microsoft.com/office/drawing/2015/9/8/chartex" xmlns:cx2="http://schemas.microsoft.com/office/drawing/2015/10/21/chartex" xmlns:cx3="http://schemas.microsoft.com/office/drawing/2016/5/9/chartex" xmlns:cx4="http://schemas.microsoft.com/office/drawing/2016/5/10/chartex" xmlns:cx5="http://schemas.microsoft.com/office/drawing/2016/5/11/chartex" xmlns:cx6="http://schemas.microsoft.com/office/drawing/2016/5/12/chartex" xmlns:cx7="http://schemas.microsoft.com/office/drawing/2016/5/13/chartex" xmlns:cx8="http://schemas.microsoft.com/office/drawing/2016/5/14/chartex" xmlns:mc="http://schemas.openxmlformats.org/markup-compatibility/2006" xmlns:aink="http://schemas.microsoft.com/office/drawing/2016/ink" xmlns:am3d="http://schemas.microsoft.com/office/drawing/2017/model3d" xmlns:o="urn:schemas-microsoft-com:office:office" xmlns:oel="http://schemas.microsoft.com/office/2019/extlst" xmlns:r="http://schemas.openxmlformats.org/officeDocument/2006/relationships" xmlns:m="http://schemas.openxmlformats.org/officeDocument/2006/math" xmlns:v="urn:schemas-microsoft-com:vml" xmlns:wp14="http://schemas.microsoft.com/office/word/2010/wordprocessingDrawing" xmlns:wp="http://schemas.openxmlformats.org/drawingml/2006/wordprocessingDrawing" xmlns:w10="urn:schemas-microsoft-com:office:word" xmlns:w="http://schemas.openxmlformats.org/wordprocessingml/2006/main" xmlns:w14="http://schemas.microsoft.com/office/word/2010/wordml" xmlns:w15="http://schemas.microsoft.com/office/word/2012/wordml" xmlns:w16cex="http://schemas.microsoft.com/office/word/2018/wordml/cex" xmlns:w16cid="http://schemas.microsoft.com/office/word/2016/wordml/cid" xmlns:w16="http://schemas.microsoft.com/office/word/2018/wordml" xmlns:w16sdtdh="http://schemas.microsoft.com/office/word/2020/wordml/sdtdatahash" xmlns:w16se="http://schemas.microsoft.com/office/word/2015/wordml/symex" xmlns:wpg="http://schemas.microsoft.com/office/word/2010/wordprocessingGroup" xmlns:wpi="http://schemas.microsoft.com/office/word/2010/wordprocessingInk" xmlns:wne="http://schemas.microsoft.com/office/word/2006/wordml" xmlns:wps="http://schemas.microsoft.com/office/word/2010/wordprocessingShape" mc:Ignorable="w14 w15 w16se w16cid w16 w16cex w16sdtdh wp14">
   <w:abstractNum w:abstractNumId="0" w15:restartNumberingAfterBreak="0">
     <w:nsid w:val="00E325DA"/>
     <w:multiLevelType w:val="hybridMultilevel"/>
@@ -6752,97 +6819,97 @@
       </w:rPr>
     </w:lvl>
   </w:abstractNum>
-  <w:num w:numId="1">
+  <w:num w:numId="1" w16cid:durableId="451754452">
     <w:abstractNumId w:val="29"/>
   </w:num>
-  <w:num w:numId="2">
+  <w:num w:numId="2" w16cid:durableId="1339234061">
     <w:abstractNumId w:val="1"/>
   </w:num>
-  <w:num w:numId="3">
+  <w:num w:numId="3" w16cid:durableId="1385985678">
     <w:abstractNumId w:val="8"/>
   </w:num>
-  <w:num w:numId="4">
+  <w:num w:numId="4" w16cid:durableId="1561134796">
     <w:abstractNumId w:val="30"/>
   </w:num>
-  <w:num w:numId="5">
+  <w:num w:numId="5" w16cid:durableId="820464991">
     <w:abstractNumId w:val="16"/>
   </w:num>
-  <w:num w:numId="6">
+  <w:num w:numId="6" w16cid:durableId="961502043">
     <w:abstractNumId w:val="22"/>
   </w:num>
-  <w:num w:numId="7">
+  <w:num w:numId="7" w16cid:durableId="724639603">
     <w:abstractNumId w:val="28"/>
   </w:num>
-  <w:num w:numId="8">
+  <w:num w:numId="8" w16cid:durableId="1180390525">
     <w:abstractNumId w:val="7"/>
   </w:num>
-  <w:num w:numId="9">
+  <w:num w:numId="9" w16cid:durableId="572080584">
     <w:abstractNumId w:val="19"/>
   </w:num>
-  <w:num w:numId="10">
+  <w:num w:numId="10" w16cid:durableId="712077471">
     <w:abstractNumId w:val="21"/>
   </w:num>
-  <w:num w:numId="11">
+  <w:num w:numId="11" w16cid:durableId="2139640890">
     <w:abstractNumId w:val="23"/>
   </w:num>
-  <w:num w:numId="12">
+  <w:num w:numId="12" w16cid:durableId="802695136">
     <w:abstractNumId w:val="14"/>
   </w:num>
-  <w:num w:numId="13">
+  <w:num w:numId="13" w16cid:durableId="1789427584">
     <w:abstractNumId w:val="26"/>
   </w:num>
-  <w:num w:numId="14">
+  <w:num w:numId="14" w16cid:durableId="1878812627">
     <w:abstractNumId w:val="0"/>
   </w:num>
-  <w:num w:numId="15">
+  <w:num w:numId="15" w16cid:durableId="373503045">
     <w:abstractNumId w:val="9"/>
   </w:num>
-  <w:num w:numId="16">
+  <w:num w:numId="16" w16cid:durableId="686757337">
     <w:abstractNumId w:val="12"/>
   </w:num>
-  <w:num w:numId="17">
+  <w:num w:numId="17" w16cid:durableId="518546653">
     <w:abstractNumId w:val="15"/>
   </w:num>
-  <w:num w:numId="18">
+  <w:num w:numId="18" w16cid:durableId="1349021600">
     <w:abstractNumId w:val="25"/>
   </w:num>
-  <w:num w:numId="19">
+  <w:num w:numId="19" w16cid:durableId="1993367350">
     <w:abstractNumId w:val="17"/>
   </w:num>
-  <w:num w:numId="20">
+  <w:num w:numId="20" w16cid:durableId="2105152549">
     <w:abstractNumId w:val="18"/>
   </w:num>
-  <w:num w:numId="21">
+  <w:num w:numId="21" w16cid:durableId="251475109">
     <w:abstractNumId w:val="27"/>
   </w:num>
-  <w:num w:numId="22">
+  <w:num w:numId="22" w16cid:durableId="432169765">
     <w:abstractNumId w:val="3"/>
   </w:num>
-  <w:num w:numId="23">
+  <w:num w:numId="23" w16cid:durableId="2050719131">
     <w:abstractNumId w:val="24"/>
   </w:num>
-  <w:num w:numId="24">
+  <w:num w:numId="24" w16cid:durableId="1790393451">
     <w:abstractNumId w:val="11"/>
   </w:num>
-  <w:num w:numId="25">
+  <w:num w:numId="25" w16cid:durableId="991566284">
     <w:abstractNumId w:val="10"/>
   </w:num>
-  <w:num w:numId="26">
+  <w:num w:numId="26" w16cid:durableId="1420297531">
     <w:abstractNumId w:val="4"/>
   </w:num>
-  <w:num w:numId="27">
+  <w:num w:numId="27" w16cid:durableId="525797879">
     <w:abstractNumId w:val="6"/>
   </w:num>
-  <w:num w:numId="28">
+  <w:num w:numId="28" w16cid:durableId="1035739908">
     <w:abstractNumId w:val="5"/>
   </w:num>
-  <w:num w:numId="29">
+  <w:num w:numId="29" w16cid:durableId="391542810">
     <w:abstractNumId w:val="20"/>
   </w:num>
-  <w:num w:numId="30">
+  <w:num w:numId="30" w16cid:durableId="2045669744">
     <w:abstractNumId w:val="2"/>
   </w:num>
-  <w:num w:numId="31">
+  <w:num w:numId="31" w16cid:durableId="825169273">
     <w:abstractNumId w:val="13"/>
   </w:num>
 </w:numbering>

</xml_diff>

<commit_message>
feat: opd tz signed
</commit_message>
<xml_diff>
--- a/Основы профессиональной деятельности/ТЗ 2 сем.docx
+++ b/Основы профессиональной деятельности/ТЗ 2 сем.docx
@@ -13,6 +13,76 @@
           <w:szCs w:val="28"/>
         </w:rPr>
       </w:pPr>
+      <w:r>
+        <w:rPr>
+          <w:noProof/>
+          <w:sz w:val="28"/>
+          <w:szCs w:val="28"/>
+          <w:lang w:val="en-US"/>
+        </w:rPr>
+        <w:drawing>
+          <wp:anchor distT="0" distB="0" distL="114300" distR="114300" simplePos="0" relativeHeight="251658240" behindDoc="0" locked="0" layoutInCell="1" allowOverlap="1" wp14:anchorId="407A1A84" wp14:editId="590E7A33">
+            <wp:simplePos x="0" y="0"/>
+            <wp:positionH relativeFrom="column">
+              <wp:posOffset>-1080135</wp:posOffset>
+            </wp:positionH>
+            <wp:positionV relativeFrom="paragraph">
+              <wp:posOffset>-720090</wp:posOffset>
+            </wp:positionV>
+            <wp:extent cx="7653600" cy="10818000"/>
+            <wp:effectExtent l="0" t="0" r="0" b="0"/>
+            <wp:wrapNone/>
+            <wp:docPr id="1" name="Рисунок 1"/>
+            <wp:cNvGraphicFramePr>
+              <a:graphicFrameLocks xmlns:a="http://schemas.openxmlformats.org/drawingml/2006/main" noChangeAspect="1"/>
+            </wp:cNvGraphicFramePr>
+            <a:graphic xmlns:a="http://schemas.openxmlformats.org/drawingml/2006/main">
+              <a:graphicData uri="http://schemas.openxmlformats.org/drawingml/2006/picture">
+                <pic:pic xmlns:pic="http://schemas.openxmlformats.org/drawingml/2006/picture">
+                  <pic:nvPicPr>
+                    <pic:cNvPr id="0" name="Picture 1"/>
+                    <pic:cNvPicPr>
+                      <a:picLocks noChangeAspect="1" noChangeArrowheads="1"/>
+                    </pic:cNvPicPr>
+                  </pic:nvPicPr>
+                  <pic:blipFill>
+                    <a:blip r:embed="rId8">
+                      <a:extLst>
+                        <a:ext uri="{28A0092B-C50C-407E-A947-70E740481C1C}">
+                          <a14:useLocalDpi xmlns:a14="http://schemas.microsoft.com/office/drawing/2010/main" val="0"/>
+                        </a:ext>
+                      </a:extLst>
+                    </a:blip>
+                    <a:srcRect/>
+                    <a:stretch>
+                      <a:fillRect/>
+                    </a:stretch>
+                  </pic:blipFill>
+                  <pic:spPr bwMode="auto">
+                    <a:xfrm>
+                      <a:off x="0" y="0"/>
+                      <a:ext cx="7653600" cy="10818000"/>
+                    </a:xfrm>
+                    <a:prstGeom prst="rect">
+                      <a:avLst/>
+                    </a:prstGeom>
+                    <a:noFill/>
+                    <a:ln>
+                      <a:noFill/>
+                    </a:ln>
+                  </pic:spPr>
+                </pic:pic>
+              </a:graphicData>
+            </a:graphic>
+            <wp14:sizeRelH relativeFrom="margin">
+              <wp14:pctWidth>0</wp14:pctWidth>
+            </wp14:sizeRelH>
+            <wp14:sizeRelV relativeFrom="margin">
+              <wp14:pctHeight>0</wp14:pctHeight>
+            </wp14:sizeRelV>
+          </wp:anchor>
+        </w:drawing>
+      </w:r>
       <w:proofErr w:type="spellStart"/>
       <w:r>
         <w:rPr>
@@ -127,6 +197,7 @@
         <w:rPr>
           <w:sz w:val="28"/>
           <w:szCs w:val="28"/>
+          <w:lang w:val="en-US"/>
         </w:rPr>
       </w:pPr>
     </w:p>
@@ -2571,8 +2642,8 @@
       </w:pPr>
     </w:p>
     <w:sectPr>
-      <w:footerReference w:type="default" r:id="rId8"/>
-      <w:footerReference w:type="first" r:id="rId9"/>
+      <w:footerReference w:type="default" r:id="rId9"/>
+      <w:footerReference w:type="first" r:id="rId10"/>
       <w:type w:val="continuous"/>
       <w:pgSz w:w="11906" w:h="16838"/>
       <w:pgMar w:top="1134" w:right="851" w:bottom="1134" w:left="1701" w:header="709" w:footer="709" w:gutter="0"/>
@@ -2619,6 +2690,7 @@
         <w:docPartUnique/>
       </w:docPartObj>
     </w:sdtPr>
+    <w:sdtEndPr/>
     <w:sdtContent>
       <w:p>
         <w:pPr>

</xml_diff>